<commit_message>
This isn't the end, it's the denoument.
</commit_message>
<xml_diff>
--- a/Chapter 022 - Gold.docx
+++ b/Chapter 022 - Gold.docx
@@ -43,13 +43,26 @@
     </w:p>
     <w:p>
       <w:r>
-        <w:t>“Bollocks is he Boht’s nephew.</w:t>
+        <w:t xml:space="preserve">“Bollocks is he </w:t>
+      </w:r>
+      <w:proofErr w:type="spellStart"/>
+      <w:r>
+        <w:t>Boht’s</w:t>
+      </w:r>
+      <w:proofErr w:type="spellEnd"/>
+      <w:r>
+        <w:t xml:space="preserve"> nephew.</w:t>
       </w:r>
       <w:r>
         <w:t xml:space="preserve"> </w:t>
       </w:r>
-      <w:r>
-        <w:t>Boht doesn’t exist. You know that. And neither does Terpsichore. What’s the first thing you do when you get even the suggestion of a new client?”</w:t>
+      <w:proofErr w:type="spellStart"/>
+      <w:r>
+        <w:t>Boht</w:t>
+      </w:r>
+      <w:proofErr w:type="spellEnd"/>
+      <w:r>
+        <w:t xml:space="preserve"> doesn’t exist. You know that. And neither does Terpsichore. What’s the first thing you do when you get even the suggestion of a new client?”</w:t>
       </w:r>
       <w:r>
         <w:br/>
@@ -126,11 +139,19 @@
         <w:br/>
         <w:t xml:space="preserve">“OK, let me have a go. </w:t>
       </w:r>
-      <w:r>
-        <w:rPr>
-          <w:lang w:val="en-GB"/>
-        </w:rPr>
-        <w:t>Collaigne-Schotts</w:t>
+      <w:proofErr w:type="spellStart"/>
+      <w:r>
+        <w:rPr>
+          <w:lang w:val="en-GB"/>
+        </w:rPr>
+        <w:t>Collaigne</w:t>
+      </w:r>
+      <w:proofErr w:type="spellEnd"/>
+      <w:r>
+        <w:rPr>
+          <w:lang w:val="en-GB"/>
+        </w:rPr>
+        <w:t>-Schotts</w:t>
       </w:r>
       <w:r>
         <w:rPr>
@@ -156,7 +177,21 @@
           <w:lang w:val="en-GB"/>
         </w:rPr>
         <w:br/>
-        <w:t>“You thought Ulysses Boht was Dobby Brand didn’t you?”</w:t>
+        <w:t xml:space="preserve">“You thought Ulysses </w:t>
+      </w:r>
+      <w:proofErr w:type="spellStart"/>
+      <w:r>
+        <w:rPr>
+          <w:lang w:val="en-GB"/>
+        </w:rPr>
+        <w:t>Boht</w:t>
+      </w:r>
+      <w:proofErr w:type="spellEnd"/>
+      <w:r>
+        <w:rPr>
+          <w:lang w:val="en-GB"/>
+        </w:rPr>
+        <w:t xml:space="preserve"> was Dobby Brand didn’t you?”</w:t>
       </w:r>
     </w:p>
     <w:p>
@@ -274,7 +309,21 @@
           <w:lang w:val="en-GB"/>
         </w:rPr>
         <w:lastRenderedPageBreak/>
-        <w:t>“Look Ernie, what are you going to do? Someone comes to you and says they think they’re onto the Collaign-Shotts gold, but they don’t trust the Met.”</w:t>
+        <w:t xml:space="preserve">“Look Ernie, what are you going to do? Someone comes to you and says they think they’re onto the </w:t>
+      </w:r>
+      <w:proofErr w:type="spellStart"/>
+      <w:r>
+        <w:rPr>
+          <w:lang w:val="en-GB"/>
+        </w:rPr>
+        <w:t>Collaign</w:t>
+      </w:r>
+      <w:proofErr w:type="spellEnd"/>
+      <w:r>
+        <w:rPr>
+          <w:lang w:val="en-GB"/>
+        </w:rPr>
+        <w:t>-Shotts gold, but they don’t trust the Met.”</w:t>
       </w:r>
       <w:r>
         <w:rPr>
@@ -401,7 +450,21 @@
         <w:rPr>
           <w:lang w:val="en-GB"/>
         </w:rPr>
-        <w:t xml:space="preserve">“Boht didn’t have a mole. </w:t>
+        <w:t>“</w:t>
+      </w:r>
+      <w:proofErr w:type="spellStart"/>
+      <w:r>
+        <w:rPr>
+          <w:lang w:val="en-GB"/>
+        </w:rPr>
+        <w:t>Boht</w:t>
+      </w:r>
+      <w:proofErr w:type="spellEnd"/>
+      <w:r>
+        <w:rPr>
+          <w:lang w:val="en-GB"/>
+        </w:rPr>
+        <w:t xml:space="preserve"> didn’t have a mole. </w:t>
       </w:r>
       <w:r>
         <w:rPr>
@@ -446,11 +509,19 @@
         </w:rPr>
         <w:t xml:space="preserve">I think whoever </w:t>
       </w:r>
-      <w:r>
-        <w:rPr>
-          <w:lang w:val="en-GB"/>
-        </w:rPr>
-        <w:t xml:space="preserve">Boht was, he </w:t>
+      <w:proofErr w:type="spellStart"/>
+      <w:r>
+        <w:rPr>
+          <w:lang w:val="en-GB"/>
+        </w:rPr>
+        <w:t>Boht</w:t>
+      </w:r>
+      <w:proofErr w:type="spellEnd"/>
+      <w:r>
+        <w:rPr>
+          <w:lang w:val="en-GB"/>
+        </w:rPr>
+        <w:t xml:space="preserve"> was, he </w:t>
       </w:r>
       <w:r>
         <w:rPr>
@@ -637,7 +708,21 @@
         <w:rPr>
           <w:lang w:val="en-GB"/>
         </w:rPr>
-        <w:t>“Like Astrid’s guys never found it. Is there some point Yan when we’re gong to stop pretending that</w:t>
+        <w:t xml:space="preserve">“Like Astrid’s guys never found it. Is there some point Yan when we’re </w:t>
+      </w:r>
+      <w:proofErr w:type="spellStart"/>
+      <w:r>
+        <w:rPr>
+          <w:lang w:val="en-GB"/>
+        </w:rPr>
+        <w:t>gong</w:t>
+      </w:r>
+      <w:proofErr w:type="spellEnd"/>
+      <w:r>
+        <w:rPr>
+          <w:lang w:val="en-GB"/>
+        </w:rPr>
+        <w:t xml:space="preserve"> to stop pretending that</w:t>
       </w:r>
       <w:r>
         <w:rPr>
@@ -977,7 +1062,21 @@
         <w:rPr>
           <w:lang w:val="en-GB"/>
         </w:rPr>
-        <w:t>far as I can see. Boht just inherited it.</w:t>
+        <w:t xml:space="preserve">far as I can see. </w:t>
+      </w:r>
+      <w:proofErr w:type="spellStart"/>
+      <w:r>
+        <w:rPr>
+          <w:lang w:val="en-GB"/>
+        </w:rPr>
+        <w:t>Boht</w:t>
+      </w:r>
+      <w:proofErr w:type="spellEnd"/>
+      <w:r>
+        <w:rPr>
+          <w:lang w:val="en-GB"/>
+        </w:rPr>
+        <w:t xml:space="preserve"> just inherited it.</w:t>
       </w:r>
       <w:r>
         <w:rPr>
@@ -1144,7 +1243,35 @@
         <w:rPr>
           <w:lang w:val="en-GB"/>
         </w:rPr>
-        <w:t xml:space="preserve"> Too much gold for Collaign-Schotts. I looked it up. Too much gold for Collaign-Schotts</w:t>
+        <w:t xml:space="preserve"> Too much gold for </w:t>
+      </w:r>
+      <w:proofErr w:type="spellStart"/>
+      <w:r>
+        <w:rPr>
+          <w:lang w:val="en-GB"/>
+        </w:rPr>
+        <w:t>Collaign</w:t>
+      </w:r>
+      <w:proofErr w:type="spellEnd"/>
+      <w:r>
+        <w:rPr>
+          <w:lang w:val="en-GB"/>
+        </w:rPr>
+        <w:t xml:space="preserve">-Schotts. I looked it up. Too much gold for </w:t>
+      </w:r>
+      <w:proofErr w:type="spellStart"/>
+      <w:r>
+        <w:rPr>
+          <w:lang w:val="en-GB"/>
+        </w:rPr>
+        <w:t>Collaign</w:t>
+      </w:r>
+      <w:proofErr w:type="spellEnd"/>
+      <w:r>
+        <w:rPr>
+          <w:lang w:val="en-GB"/>
+        </w:rPr>
+        <w:t>-Schotts</w:t>
       </w:r>
       <w:r>
         <w:rPr>
@@ -1238,7 +1365,21 @@
           <w:lang w:val="en-GB"/>
         </w:rPr>
         <w:br/>
-        <w:t>“Oh! And you’re Lenny Bracks! The international gold thief who went to university. Did you really do a Masters degree in critical theory?”</w:t>
+        <w:t xml:space="preserve">“Oh! And you’re Lenny Bracks! The international gold thief who went to university. Did you really do a </w:t>
+      </w:r>
+      <w:proofErr w:type="spellStart"/>
+      <w:r>
+        <w:rPr>
+          <w:lang w:val="en-GB"/>
+        </w:rPr>
+        <w:t>Masters</w:t>
+      </w:r>
+      <w:proofErr w:type="spellEnd"/>
+      <w:r>
+        <w:rPr>
+          <w:lang w:val="en-GB"/>
+        </w:rPr>
+        <w:t xml:space="preserve"> degree in critical theory?”</w:t>
       </w:r>
     </w:p>
     <w:p>
@@ -1296,20 +1437,59 @@
         <w:rPr>
           <w:lang w:val="en-GB"/>
         </w:rPr>
-        <w:t xml:space="preserve">Here’s the weird thing about sitting in the middle of a bi cursal maze – if somebody breaks down the door – you can hear them. But there’s no straight forward way to rush to meet them. </w:t>
-      </w:r>
-    </w:p>
-    <w:p>
-      <w:pPr>
-        <w:rPr>
-          <w:lang w:val="en-GB"/>
-        </w:rPr>
-      </w:pPr>
-      <w:r>
-        <w:rPr>
-          <w:lang w:val="en-GB"/>
-        </w:rPr>
-        <w:t>So when the doors at the back of the school room were literally blown off their hinges. All anyone could do was wait. Wait and listen to the sound of very confused military sounding voices obviously talking to each other into their radios.</w:t>
+        <w:t xml:space="preserve">Here’s the weird thing about sitting in the middle of a bi </w:t>
+      </w:r>
+      <w:proofErr w:type="spellStart"/>
+      <w:r>
+        <w:rPr>
+          <w:lang w:val="en-GB"/>
+        </w:rPr>
+        <w:t>cursal</w:t>
+      </w:r>
+      <w:proofErr w:type="spellEnd"/>
+      <w:r>
+        <w:rPr>
+          <w:lang w:val="en-GB"/>
+        </w:rPr>
+        <w:t xml:space="preserve"> maze – if somebody breaks down the door – you can hear them. But there’s no straight forward way to rush to meet them. </w:t>
+      </w:r>
+    </w:p>
+    <w:p>
+      <w:pPr>
+        <w:rPr>
+          <w:lang w:val="en-GB"/>
+        </w:rPr>
+      </w:pPr>
+      <w:r>
+        <w:rPr>
+          <w:lang w:val="en-GB"/>
+        </w:rPr>
+        <w:t>So</w:t>
+      </w:r>
+      <w:r>
+        <w:rPr>
+          <w:lang w:val="en-GB"/>
+        </w:rPr>
+        <w:t>,</w:t>
+      </w:r>
+      <w:r>
+        <w:rPr>
+          <w:lang w:val="en-GB"/>
+        </w:rPr>
+        <w:t xml:space="preserve"> when the doors at the back of the school room were literally blown off their hinges. All anyone could do was wait. Wait and listen to the sound of very confused military sounding voices obviously talking to each other into their radios.</w:t>
+      </w:r>
+    </w:p>
+    <w:p>
+      <w:pPr>
+        <w:rPr>
+          <w:lang w:val="en-GB"/>
+        </w:rPr>
+      </w:pPr>
+      <w:r>
+        <w:rPr>
+          <w:lang w:val="en-GB"/>
+        </w:rPr>
+        <w:t xml:space="preserve">The were shouting “clear” a lot. </w:t>
       </w:r>
     </w:p>
     <w:p>
@@ -1350,13 +1530,339 @@
           <w:lang w:val="en-GB"/>
         </w:rPr>
       </w:pPr>
-    </w:p>
-    <w:p>
-      <w:pPr>
-        <w:rPr>
-          <w:lang w:val="en-GB"/>
-        </w:rPr>
-      </w:pPr>
+      <w:r>
+        <w:rPr>
+          <w:lang w:val="en-GB"/>
+        </w:rPr>
+        <w:t>Then there was another awkward pause.</w:t>
+      </w:r>
+    </w:p>
+    <w:p>
+      <w:pPr>
+        <w:rPr>
+          <w:lang w:val="en-GB"/>
+        </w:rPr>
+      </w:pPr>
+      <w:r>
+        <w:rPr>
+          <w:lang w:val="en-GB"/>
+        </w:rPr>
+        <w:t>Finally, Gary Ventisi walked into the middle.</w:t>
+      </w:r>
+    </w:p>
+    <w:p>
+      <w:pPr>
+        <w:rPr>
+          <w:lang w:val="en-GB"/>
+        </w:rPr>
+      </w:pPr>
+      <w:r>
+        <w:rPr>
+          <w:lang w:val="en-GB"/>
+        </w:rPr>
+        <w:t>“I suppose you’re wondering why I gathered you all here today?” deciding it was probably OK to pace while he was talking, he gave up his perch on the ottoman and let the deputy commissioner sit down.</w:t>
+      </w:r>
+    </w:p>
+    <w:p>
+      <w:pPr>
+        <w:rPr>
+          <w:lang w:val="en-GB"/>
+        </w:rPr>
+      </w:pPr>
+      <w:r>
+        <w:rPr>
+          <w:lang w:val="en-GB"/>
+        </w:rPr>
+        <w:t xml:space="preserve">“These are the facts in order. </w:t>
+      </w:r>
+    </w:p>
+    <w:p>
+      <w:pPr>
+        <w:rPr>
+          <w:lang w:val="en-GB"/>
+        </w:rPr>
+      </w:pPr>
+      <w:r>
+        <w:rPr>
+          <w:lang w:val="en-GB"/>
+        </w:rPr>
+        <w:t xml:space="preserve">My best friend Jacky Spanner dies – fact. </w:t>
+      </w:r>
+    </w:p>
+    <w:p>
+      <w:pPr>
+        <w:rPr>
+          <w:lang w:val="en-GB"/>
+        </w:rPr>
+      </w:pPr>
+      <w:r>
+        <w:rPr>
+          <w:lang w:val="en-GB"/>
+        </w:rPr>
+        <w:lastRenderedPageBreak/>
+        <w:t>In suspicious circumstances</w:t>
+      </w:r>
+      <w:r>
+        <w:rPr>
+          <w:lang w:val="en-GB"/>
+        </w:rPr>
+        <w:t xml:space="preserve"> – supposition.</w:t>
+      </w:r>
+      <w:r>
+        <w:rPr>
+          <w:lang w:val="en-GB"/>
+        </w:rPr>
+        <w:t xml:space="preserve"> </w:t>
+      </w:r>
+    </w:p>
+    <w:p>
+      <w:pPr>
+        <w:rPr>
+          <w:lang w:val="en-GB"/>
+        </w:rPr>
+      </w:pPr>
+      <w:r>
+        <w:rPr>
+          <w:lang w:val="en-GB"/>
+        </w:rPr>
+        <w:t xml:space="preserve">The police say it’s a suicide – fact. </w:t>
+      </w:r>
+    </w:p>
+    <w:p>
+      <w:pPr>
+        <w:rPr>
+          <w:lang w:val="en-GB"/>
+        </w:rPr>
+      </w:pPr>
+      <w:r>
+        <w:rPr>
+          <w:lang w:val="en-GB"/>
+        </w:rPr>
+        <w:t xml:space="preserve">My car blows up – fact. I’m not in it – fact. </w:t>
+      </w:r>
+    </w:p>
+    <w:p>
+      <w:pPr>
+        <w:rPr>
+          <w:lang w:val="en-GB"/>
+        </w:rPr>
+      </w:pPr>
+      <w:r>
+        <w:rPr>
+          <w:lang w:val="en-GB"/>
+        </w:rPr>
+        <w:t>S</w:t>
+      </w:r>
+      <w:r>
+        <w:rPr>
+          <w:lang w:val="en-GB"/>
+        </w:rPr>
+        <w:t>omeone hoped I would be</w:t>
+      </w:r>
+      <w:r>
+        <w:rPr>
+          <w:lang w:val="en-GB"/>
+        </w:rPr>
+        <w:t xml:space="preserve"> in it</w:t>
+      </w:r>
+      <w:r>
+        <w:rPr>
+          <w:lang w:val="en-GB"/>
+        </w:rPr>
+        <w:t xml:space="preserve"> – </w:t>
+      </w:r>
+      <w:r>
+        <w:rPr>
+          <w:lang w:val="en-GB"/>
+        </w:rPr>
+        <w:t>supposition.</w:t>
+      </w:r>
+    </w:p>
+    <w:p>
+      <w:pPr>
+        <w:rPr>
+          <w:lang w:val="en-GB"/>
+        </w:rPr>
+      </w:pPr>
+      <w:r>
+        <w:rPr>
+          <w:lang w:val="en-GB"/>
+        </w:rPr>
+        <w:t>I’m in a tricky situation – fact. I’m literally in the gutter with an old lady who feeds the pigeons – fact.</w:t>
+      </w:r>
+    </w:p>
+    <w:p>
+      <w:pPr>
+        <w:rPr>
+          <w:lang w:val="en-GB"/>
+        </w:rPr>
+      </w:pPr>
+      <w:r>
+        <w:rPr>
+          <w:lang w:val="en-GB"/>
+        </w:rPr>
+        <w:t>Jan Pausing is my friend – turns out that was just a supposition.</w:t>
+      </w:r>
+    </w:p>
+    <w:p>
+      <w:pPr>
+        <w:rPr>
+          <w:lang w:val="en-GB"/>
+        </w:rPr>
+      </w:pPr>
+      <w:r>
+        <w:rPr>
+          <w:lang w:val="en-GB"/>
+        </w:rPr>
+        <w:t>He suggests I do a job for him as a live-in guardian – fact.</w:t>
+      </w:r>
+    </w:p>
+    <w:p>
+      <w:pPr>
+        <w:rPr>
+          <w:lang w:val="en-GB"/>
+        </w:rPr>
+      </w:pPr>
+      <w:r>
+        <w:rPr>
+          <w:lang w:val="en-GB"/>
+        </w:rPr>
+        <w:t>I believe him when he says it will be an opportunity to lay low – fact.</w:t>
+      </w:r>
+    </w:p>
+    <w:p>
+      <w:pPr>
+        <w:rPr>
+          <w:lang w:val="en-GB"/>
+        </w:rPr>
+      </w:pPr>
+      <w:r>
+        <w:rPr>
+          <w:lang w:val="en-GB"/>
+        </w:rPr>
+        <w:t>I am an utter moron</w:t>
+      </w:r>
+      <w:r>
+        <w:rPr>
+          <w:lang w:val="en-GB"/>
+        </w:rPr>
+        <w:t xml:space="preserve"> who’s easily fooled</w:t>
+      </w:r>
+      <w:r>
+        <w:rPr>
+          <w:lang w:val="en-GB"/>
+        </w:rPr>
+        <w:t xml:space="preserve"> – well, it’s not a supposition.</w:t>
+      </w:r>
+    </w:p>
+    <w:p>
+      <w:pPr>
+        <w:rPr>
+          <w:lang w:val="en-GB"/>
+        </w:rPr>
+      </w:pPr>
+      <w:r>
+        <w:rPr>
+          <w:lang w:val="en-GB"/>
+        </w:rPr>
+        <w:t>My car is a bit – well, easy to spot – fact.</w:t>
+      </w:r>
+    </w:p>
+    <w:p>
+      <w:pPr>
+        <w:rPr>
+          <w:lang w:val="en-GB"/>
+        </w:rPr>
+      </w:pPr>
+      <w:r>
+        <w:rPr>
+          <w:lang w:val="en-GB"/>
+        </w:rPr>
+        <w:t>And I notice the garage is empty – fact.</w:t>
+      </w:r>
+    </w:p>
+    <w:p>
+      <w:pPr>
+        <w:rPr>
+          <w:lang w:val="en-GB"/>
+        </w:rPr>
+      </w:pPr>
+      <w:r>
+        <w:rPr>
+          <w:lang w:val="en-GB"/>
+        </w:rPr>
+        <w:t>So</w:t>
+      </w:r>
+      <w:r>
+        <w:rPr>
+          <w:lang w:val="en-GB"/>
+        </w:rPr>
+        <w:t>,</w:t>
+      </w:r>
+      <w:r>
+        <w:rPr>
+          <w:lang w:val="en-GB"/>
+        </w:rPr>
+        <w:t xml:space="preserve"> I put my lime green coma machine – it’s mine now by the way, just in case anybody here is thinking of remembering that they’re law enforcement officers.</w:t>
+      </w:r>
+    </w:p>
+    <w:p>
+      <w:pPr>
+        <w:rPr>
+          <w:lang w:val="en-GB"/>
+        </w:rPr>
+      </w:pPr>
+      <w:r>
+        <w:rPr>
+          <w:lang w:val="en-GB"/>
+        </w:rPr>
+        <w:t>And then I’m faced with the raw facts of this place. It’s a chapel full of stuff. It’s the holy chapel full of stuff.</w:t>
+      </w:r>
+    </w:p>
+    <w:p>
+      <w:pPr>
+        <w:rPr>
+          <w:lang w:val="en-GB"/>
+        </w:rPr>
+      </w:pPr>
+      <w:r>
+        <w:rPr>
+          <w:lang w:val="en-GB"/>
+        </w:rPr>
+        <w:t xml:space="preserve">Fact – I’m here literally half a day </w:t>
+      </w:r>
+      <w:r>
+        <w:rPr>
+          <w:lang w:val="en-GB"/>
+        </w:rPr>
+        <w:t xml:space="preserve">before some breaks in. </w:t>
+      </w:r>
+    </w:p>
+    <w:p>
+      <w:pPr>
+        <w:rPr>
+          <w:lang w:val="en-GB"/>
+        </w:rPr>
+      </w:pPr>
+      <w:r>
+        <w:rPr>
+          <w:lang w:val="en-GB"/>
+        </w:rPr>
+        <w:t>Fact – they weren’t exactly ruthless professionals, but what they showed was the essential problem with this place.</w:t>
+      </w:r>
+    </w:p>
+    <w:p>
+      <w:pPr>
+        <w:rPr>
+          <w:lang w:val="en-GB"/>
+        </w:rPr>
+      </w:pPr>
+      <w:r>
+        <w:rPr>
+          <w:lang w:val="en-GB"/>
+        </w:rPr>
+        <w:t>There’s too much stuff. Is some of it gold? Maybe did somebody use the gold to buy rare books and China? Maybe? Could you just grab something and run off with it and hope it’s valuable, yes, yes, you could, but that’s not much of a strategy if you suspect that there is 26 million pounds worth of gold here, is it?</w:t>
+      </w:r>
     </w:p>
     <w:p>
       <w:pPr>

</xml_diff>

<commit_message>
This looks like a denoument
</commit_message>
<xml_diff>
--- a/Chapter 022 - Gold.docx
+++ b/Chapter 022 - Gold.docx
@@ -73,7 +73,13 @@
         <w:t>“You check them out. Don’t you Yan. Because yo</w:t>
       </w:r>
       <w:r>
-        <w:t>u, certainly of the tow of us,</w:t>
+        <w:t>u, certainly of the tw</w:t>
+      </w:r>
+      <w:r>
+        <w:t>o</w:t>
+      </w:r>
+      <w:r>
+        <w:t xml:space="preserve"> of us,</w:t>
       </w:r>
       <w:r>
         <w:t xml:space="preserve"> are the fucking careful one. You are the one who doesn’t go strolling into danger</w:t>
@@ -113,7 +119,13 @@
         </w:rPr>
       </w:pPr>
       <w:r>
-        <w:t>“If you remember, you were in a bit of a spot. Jackie had just – well, officially killed himself. And your car exploded! You said you needed somewhere to go, and well, I was just putting this thin</w:t>
+        <w:t>“If you remember, you were in a bit of a spot. Jack</w:t>
+      </w:r>
+      <w:r>
+        <w:t>y</w:t>
+      </w:r>
+      <w:r>
+        <w:t xml:space="preserve"> had just – well, officially killed himself. And your car exploded! You said you needed somewhere to go, and well, I was just putting this thin</w:t>
       </w:r>
       <w:r>
         <w:t>g together.</w:t>
@@ -123,7 +135,15 @@
       </w:r>
       <w:r>
         <w:br/>
-        <w:t>“What is this thing Yan?”</w:t>
+        <w:t xml:space="preserve">“What is this </w:t>
+      </w:r>
+      <w:proofErr w:type="gramStart"/>
+      <w:r>
+        <w:t>thing</w:t>
+      </w:r>
+      <w:proofErr w:type="gramEnd"/>
+      <w:r>
+        <w:t xml:space="preserve"> Yan?”</w:t>
       </w:r>
       <w:r>
         <w:br/>
@@ -170,7 +190,19 @@
         <w:rPr>
           <w:lang w:val="en-GB"/>
         </w:rPr>
-        <w:t>“How did you?”</w:t>
+        <w:t>“How did you</w:t>
+      </w:r>
+      <w:r>
+        <w:rPr>
+          <w:lang w:val="en-GB"/>
+        </w:rPr>
+        <w:t>…</w:t>
+      </w:r>
+      <w:r>
+        <w:rPr>
+          <w:lang w:val="en-GB"/>
+        </w:rPr>
+        <w:t>?”</w:t>
       </w:r>
       <w:r>
         <w:rPr>
@@ -289,7 +321,13 @@
         <w:rPr>
           <w:lang w:val="en-GB"/>
         </w:rPr>
-        <w:t xml:space="preserve">. </w:t>
+        <w:t>!</w:t>
+      </w:r>
+      <w:r>
+        <w:rPr>
+          <w:lang w:val="en-GB"/>
+        </w:rPr>
+        <w:t xml:space="preserve"> </w:t>
       </w:r>
       <w:r>
         <w:rPr>
@@ -309,7 +347,45 @@
           <w:lang w:val="en-GB"/>
         </w:rPr>
         <w:lastRenderedPageBreak/>
-        <w:t xml:space="preserve">“Look Ernie, what are you going to do? Someone comes to you and says they think they’re onto the </w:t>
+        <w:t>“Look Ernie, what</w:t>
+      </w:r>
+      <w:r>
+        <w:rPr>
+          <w:lang w:val="en-GB"/>
+        </w:rPr>
+        <w:t xml:space="preserve"> would you have done</w:t>
+      </w:r>
+      <w:r>
+        <w:rPr>
+          <w:lang w:val="en-GB"/>
+        </w:rPr>
+        <w:t>?</w:t>
+      </w:r>
+      <w:r>
+        <w:rPr>
+          <w:lang w:val="en-GB"/>
+        </w:rPr>
+        <w:t xml:space="preserve"> </w:t>
+      </w:r>
+      <w:proofErr w:type="gramStart"/>
+      <w:r>
+        <w:rPr>
+          <w:lang w:val="en-GB"/>
+        </w:rPr>
+        <w:t>Actually, that’s</w:t>
+      </w:r>
+      <w:proofErr w:type="gramEnd"/>
+      <w:r>
+        <w:rPr>
+          <w:lang w:val="en-GB"/>
+        </w:rPr>
+        <w:t xml:space="preserve"> probably not a good way of thinking about this. Look!</w:t>
+      </w:r>
+      <w:r>
+        <w:rPr>
+          <w:lang w:val="en-GB"/>
+        </w:rPr>
+        <w:t xml:space="preserve"> Someone comes to you and says they think they’re onto the </w:t>
       </w:r>
       <w:proofErr w:type="spellStart"/>
       <w:r>
@@ -323,7 +399,21 @@
         <w:rPr>
           <w:lang w:val="en-GB"/>
         </w:rPr>
-        <w:t>-Shotts gold, but they don’t trust the Met.”</w:t>
+        <w:t>-</w:t>
+      </w:r>
+      <w:proofErr w:type="gramStart"/>
+      <w:r>
+        <w:rPr>
+          <w:lang w:val="en-GB"/>
+        </w:rPr>
+        <w:t>Shotts</w:t>
+      </w:r>
+      <w:proofErr w:type="gramEnd"/>
+      <w:r>
+        <w:rPr>
+          <w:lang w:val="en-GB"/>
+        </w:rPr>
+        <w:t xml:space="preserve"> gold, but they don’t trust the Met.”</w:t>
       </w:r>
       <w:r>
         <w:rPr>
@@ -381,7 +471,241 @@
         <w:rPr>
           <w:lang w:val="en-GB"/>
         </w:rPr>
-        <w:t>“How can you be so sure of that Ernie.</w:t>
+        <w:t>“How can you be so sure of that Ernie</w:t>
+      </w:r>
+      <w:r>
+        <w:rPr>
+          <w:lang w:val="en-GB"/>
+        </w:rPr>
+        <w:t>?</w:t>
+      </w:r>
+    </w:p>
+    <w:p>
+      <w:pPr>
+        <w:rPr>
+          <w:lang w:val="en-GB"/>
+        </w:rPr>
+      </w:pPr>
+      <w:r>
+        <w:rPr>
+          <w:lang w:val="en-GB"/>
+        </w:rPr>
+        <w:t>“</w:t>
+      </w:r>
+      <w:r>
+        <w:rPr>
+          <w:lang w:val="en-GB"/>
+        </w:rPr>
+        <w:t>Because Dobby Brand is in the freezer downstairs.”</w:t>
+      </w:r>
+    </w:p>
+    <w:p>
+      <w:pPr>
+        <w:rPr>
+          <w:lang w:val="en-GB"/>
+        </w:rPr>
+      </w:pPr>
+      <w:r>
+        <w:rPr>
+          <w:lang w:val="en-GB"/>
+        </w:rPr>
+        <w:t>Listen to that. That’s the sound of someone who always likes to know what’s happening, the sound of someone who always likes to be in control realising that he has no idea what’s happening. He has no control whatsoever.</w:t>
+      </w:r>
+    </w:p>
+    <w:p>
+      <w:pPr>
+        <w:rPr>
+          <w:lang w:val="en-GB"/>
+        </w:rPr>
+      </w:pPr>
+      <w:r>
+        <w:rPr>
+          <w:lang w:val="en-GB"/>
+        </w:rPr>
+        <w:t>“So</w:t>
+      </w:r>
+      <w:r>
+        <w:rPr>
+          <w:lang w:val="en-GB"/>
+        </w:rPr>
+        <w:t>,</w:t>
+      </w:r>
+      <w:r>
+        <w:rPr>
+          <w:lang w:val="en-GB"/>
+        </w:rPr>
+        <w:t xml:space="preserve"> somebody killed him and then started sticking on a mole? Is that what you’re </w:t>
+      </w:r>
+      <w:r>
+        <w:rPr>
+          <w:lang w:val="en-GB"/>
+        </w:rPr>
+        <w:t>saying.”</w:t>
+      </w:r>
+    </w:p>
+    <w:p>
+      <w:pPr>
+        <w:rPr>
+          <w:lang w:val="en-GB"/>
+        </w:rPr>
+      </w:pPr>
+      <w:r>
+        <w:rPr>
+          <w:lang w:val="en-GB"/>
+        </w:rPr>
+        <w:t>“</w:t>
+      </w:r>
+      <w:proofErr w:type="spellStart"/>
+      <w:r>
+        <w:rPr>
+          <w:lang w:val="en-GB"/>
+        </w:rPr>
+        <w:t>Boht</w:t>
+      </w:r>
+      <w:proofErr w:type="spellEnd"/>
+      <w:r>
+        <w:rPr>
+          <w:lang w:val="en-GB"/>
+        </w:rPr>
+        <w:t xml:space="preserve"> didn’t have a mole. </w:t>
+      </w:r>
+      <w:r>
+        <w:rPr>
+          <w:lang w:val="en-GB"/>
+        </w:rPr>
+        <w:t>He had a tiny scar</w:t>
+      </w:r>
+      <w:r>
+        <w:rPr>
+          <w:lang w:val="en-GB"/>
+        </w:rPr>
+        <w:t>, where the mole would have been.</w:t>
+      </w:r>
+      <w:r>
+        <w:rPr>
+          <w:lang w:val="en-GB"/>
+        </w:rPr>
+        <w:t xml:space="preserve"> And he didn’t look exactly like Dobby, he looked a *bit* like Dobby.</w:t>
+      </w:r>
+      <w:r>
+        <w:rPr>
+          <w:lang w:val="en-GB"/>
+        </w:rPr>
+        <w:t xml:space="preserve"> Like, you know, maybe Dobby would have looked if he’d had plastic surgery.</w:t>
+      </w:r>
+    </w:p>
+    <w:p>
+      <w:pPr>
+        <w:rPr>
+          <w:lang w:val="en-GB"/>
+        </w:rPr>
+      </w:pPr>
+      <w:r>
+        <w:rPr>
+          <w:lang w:val="en-GB"/>
+        </w:rPr>
+        <w:t>“</w:t>
+      </w:r>
+      <w:r>
+        <w:rPr>
+          <w:lang w:val="en-GB"/>
+        </w:rPr>
+        <w:t xml:space="preserve">I think whoever </w:t>
+      </w:r>
+      <w:proofErr w:type="spellStart"/>
+      <w:r>
+        <w:rPr>
+          <w:lang w:val="en-GB"/>
+        </w:rPr>
+        <w:t>Boht</w:t>
+      </w:r>
+      <w:proofErr w:type="spellEnd"/>
+      <w:r>
+        <w:rPr>
+          <w:lang w:val="en-GB"/>
+        </w:rPr>
+        <w:t xml:space="preserve"> was, he </w:t>
+      </w:r>
+      <w:r>
+        <w:rPr>
+          <w:lang w:val="en-GB"/>
+        </w:rPr>
+        <w:t xml:space="preserve">wanted people to think he </w:t>
+      </w:r>
+      <w:r>
+        <w:rPr>
+          <w:i/>
+          <w:iCs/>
+          <w:lang w:val="en-GB"/>
+        </w:rPr>
+        <w:t>might</w:t>
+      </w:r>
+      <w:r>
+        <w:rPr>
+          <w:lang w:val="en-GB"/>
+        </w:rPr>
+        <w:t xml:space="preserve"> be Dobby – but they couldn’t prove it – and he wasn’t Dobby.</w:t>
+      </w:r>
+      <w:r>
+        <w:rPr>
+          <w:lang w:val="en-GB"/>
+        </w:rPr>
+        <w:t xml:space="preserve"> So</w:t>
+      </w:r>
+      <w:r>
+        <w:rPr>
+          <w:lang w:val="en-GB"/>
+        </w:rPr>
+        <w:t>,</w:t>
+      </w:r>
+      <w:r>
+        <w:rPr>
+          <w:lang w:val="en-GB"/>
+        </w:rPr>
+        <w:t xml:space="preserve"> if the rozzers ever</w:t>
+      </w:r>
+      <w:r>
+        <w:rPr>
+          <w:lang w:val="en-GB"/>
+        </w:rPr>
+        <w:t xml:space="preserve"> did</w:t>
+      </w:r>
+      <w:r>
+        <w:rPr>
+          <w:lang w:val="en-GB"/>
+        </w:rPr>
+        <w:t xml:space="preserve"> show up – his fingerprints would be wrong.</w:t>
+      </w:r>
+      <w:r>
+        <w:rPr>
+          <w:lang w:val="en-GB"/>
+        </w:rPr>
+        <w:t xml:space="preserve"> That’s what you and Astrid thought, isn’t it?</w:t>
+      </w:r>
+      <w:r>
+        <w:rPr>
+          <w:lang w:val="en-GB"/>
+        </w:rPr>
+        <w:t>”</w:t>
+      </w:r>
+    </w:p>
+    <w:p>
+      <w:pPr>
+        <w:rPr>
+          <w:lang w:val="en-GB"/>
+        </w:rPr>
+      </w:pPr>
+      <w:r>
+        <w:rPr>
+          <w:lang w:val="en-GB"/>
+        </w:rPr>
+        <w:t>There was more of the sound of Yan Pausing trying to regain control. Which sounded an awful lot like absolute silence.</w:t>
+      </w:r>
+      <w:r>
+        <w:rPr>
+          <w:lang w:val="en-GB"/>
+        </w:rPr>
+        <w:t xml:space="preserve"> Klee carried on.</w:t>
       </w:r>
       <w:r>
         <w:rPr>
@@ -389,37 +713,99 @@
         </w:rPr>
         <w:t xml:space="preserve"> </w:t>
       </w:r>
-      <w:r>
-        <w:rPr>
-          <w:lang w:val="en-GB"/>
-        </w:rPr>
-        <w:t>Because Dobby Brand is in the freezer downstairs.”</w:t>
-      </w:r>
-    </w:p>
-    <w:p>
-      <w:pPr>
-        <w:rPr>
-          <w:lang w:val="en-GB"/>
-        </w:rPr>
-      </w:pPr>
-      <w:r>
-        <w:rPr>
-          <w:lang w:val="en-GB"/>
-        </w:rPr>
-        <w:t>Listen to that. That’s the sound of someone who always likes to know what’s happening, the sound of someone who always likes to be in control realising that he has no idea what’s happening. He has no control whatsoever.</w:t>
-      </w:r>
-    </w:p>
-    <w:p>
-      <w:pPr>
-        <w:rPr>
-          <w:lang w:val="en-GB"/>
-        </w:rPr>
-      </w:pPr>
-      <w:r>
-        <w:rPr>
-          <w:lang w:val="en-GB"/>
-        </w:rPr>
-        <w:t>“So</w:t>
+    </w:p>
+    <w:p>
+      <w:pPr>
+        <w:rPr>
+          <w:lang w:val="en-GB"/>
+        </w:rPr>
+      </w:pPr>
+      <w:r>
+        <w:rPr>
+          <w:lang w:val="en-GB"/>
+        </w:rPr>
+        <w:t>“</w:t>
+      </w:r>
+      <w:r>
+        <w:rPr>
+          <w:lang w:val="en-GB"/>
+        </w:rPr>
+        <w:t xml:space="preserve">Poor </w:t>
+      </w:r>
+      <w:r>
+        <w:rPr>
+          <w:lang w:val="en-GB"/>
+        </w:rPr>
+        <w:t>Dobby</w:t>
+      </w:r>
+      <w:r>
+        <w:rPr>
+          <w:lang w:val="en-GB"/>
+        </w:rPr>
+        <w:t xml:space="preserve">! </w:t>
+      </w:r>
+      <w:r>
+        <w:rPr>
+          <w:lang w:val="en-GB"/>
+        </w:rPr>
+        <w:t>Everybody assumed he’d done the perfect big score and disappeared.</w:t>
+      </w:r>
+      <w:r>
+        <w:rPr>
+          <w:lang w:val="en-GB"/>
+        </w:rPr>
+        <w:t xml:space="preserve"> </w:t>
+      </w:r>
+      <w:r>
+        <w:rPr>
+          <w:lang w:val="en-GB"/>
+        </w:rPr>
+        <w:t>Well, technically, that’s exactly what</w:t>
+      </w:r>
+      <w:r>
+        <w:rPr>
+          <w:lang w:val="en-GB"/>
+        </w:rPr>
+        <w:t xml:space="preserve"> he had done.</w:t>
+      </w:r>
+      <w:r>
+        <w:rPr>
+          <w:lang w:val="en-GB"/>
+        </w:rPr>
+        <w:t xml:space="preserve"> But not in a way where he could enjoy his obscurity.”</w:t>
+      </w:r>
+    </w:p>
+    <w:p>
+      <w:pPr>
+        <w:rPr>
+          <w:lang w:val="en-GB"/>
+        </w:rPr>
+      </w:pPr>
+      <w:r>
+        <w:rPr>
+          <w:lang w:val="en-GB"/>
+        </w:rPr>
+        <w:t>“</w:t>
+      </w:r>
+      <w:proofErr w:type="gramStart"/>
+      <w:r>
+        <w:rPr>
+          <w:lang w:val="en-GB"/>
+        </w:rPr>
+        <w:t>So</w:t>
+      </w:r>
+      <w:proofErr w:type="gramEnd"/>
+      <w:r>
+        <w:rPr>
+          <w:lang w:val="en-GB"/>
+        </w:rPr>
+        <w:t xml:space="preserve"> </w:t>
+      </w:r>
+      <w:r>
+        <w:rPr>
+          <w:lang w:val="en-GB"/>
+        </w:rPr>
+        <w:t>somebody found him</w:t>
       </w:r>
       <w:r>
         <w:rPr>
@@ -431,316 +817,109 @@
         <w:rPr>
           <w:lang w:val="en-GB"/>
         </w:rPr>
-        <w:t xml:space="preserve"> somebody killed him and then started sticking on a mole? Is that what you’re </w:t>
-      </w:r>
-      <w:r>
-        <w:rPr>
-          <w:lang w:val="en-GB"/>
-        </w:rPr>
-        <w:t>saying.”</w:t>
-      </w:r>
-    </w:p>
-    <w:p>
-      <w:pPr>
-        <w:rPr>
-          <w:lang w:val="en-GB"/>
-        </w:rPr>
-      </w:pPr>
-      <w:r>
-        <w:rPr>
-          <w:lang w:val="en-GB"/>
-        </w:rPr>
-        <w:t>“</w:t>
+        <w:t xml:space="preserve"> killed him, and then pretended to be him?”</w:t>
+      </w:r>
+    </w:p>
+    <w:p>
+      <w:pPr>
+        <w:rPr>
+          <w:lang w:val="en-GB"/>
+        </w:rPr>
+      </w:pPr>
+      <w:r>
+        <w:rPr>
+          <w:lang w:val="en-GB"/>
+        </w:rPr>
+        <w:t>“But if people thought he was Dobby, weren’t they going to come looking for him and the gold?”</w:t>
+      </w:r>
+    </w:p>
+    <w:p>
+      <w:pPr>
+        <w:rPr>
+          <w:lang w:val="en-GB"/>
+        </w:rPr>
+      </w:pPr>
+      <w:r>
+        <w:rPr>
+          <w:lang w:val="en-GB"/>
+        </w:rPr>
+        <w:t>“I think they did. I think lots of people came looking for the gold, but they never found it.</w:t>
+      </w:r>
+      <w:r>
+        <w:rPr>
+          <w:lang w:val="en-GB"/>
+        </w:rPr>
+        <w:t>”</w:t>
+      </w:r>
+    </w:p>
+    <w:p>
+      <w:pPr>
+        <w:rPr>
+          <w:lang w:val="en-GB"/>
+        </w:rPr>
+      </w:pPr>
+      <w:r>
+        <w:rPr>
+          <w:lang w:val="en-GB"/>
+        </w:rPr>
+        <w:t>“Like Terpsichore’s guys never found it.”</w:t>
+      </w:r>
+    </w:p>
+    <w:p>
+      <w:pPr>
+        <w:rPr>
+          <w:lang w:val="en-GB"/>
+        </w:rPr>
+      </w:pPr>
+      <w:r>
+        <w:rPr>
+          <w:lang w:val="en-GB"/>
+        </w:rPr>
+        <w:t xml:space="preserve">“Like Astrid’s guys never found it. Is there some point Yan when we’re </w:t>
       </w:r>
       <w:proofErr w:type="spellStart"/>
       <w:r>
         <w:rPr>
           <w:lang w:val="en-GB"/>
         </w:rPr>
-        <w:t>Boht</w:t>
+        <w:t>gong</w:t>
       </w:r>
       <w:proofErr w:type="spellEnd"/>
       <w:r>
         <w:rPr>
           <w:lang w:val="en-GB"/>
         </w:rPr>
-        <w:t xml:space="preserve"> didn’t have a mole. </w:t>
-      </w:r>
-      <w:r>
-        <w:rPr>
-          <w:lang w:val="en-GB"/>
-        </w:rPr>
-        <w:t>He had a tiny scar</w:t>
-      </w:r>
-      <w:r>
-        <w:rPr>
-          <w:lang w:val="en-GB"/>
-        </w:rPr>
-        <w:t>, where the mole would have been.</w:t>
-      </w:r>
-      <w:r>
-        <w:rPr>
-          <w:lang w:val="en-GB"/>
-        </w:rPr>
-        <w:t xml:space="preserve"> And he didn’t look exactly like Dobby, he looked a *bit* like Dobby.</w:t>
-      </w:r>
-      <w:r>
-        <w:rPr>
-          <w:lang w:val="en-GB"/>
-        </w:rPr>
-        <w:t xml:space="preserve"> Like, you know, maybe Dobby would have looked if he’d had plastic surgery.</w:t>
+        <w:t xml:space="preserve"> to stop pretending that</w:t>
+      </w:r>
+      <w:r>
+        <w:rPr>
+          <w:lang w:val="en-GB"/>
+        </w:rPr>
+        <w:t xml:space="preserve"> she</w:t>
+      </w:r>
+      <w:r>
+        <w:rPr>
+          <w:lang w:val="en-GB"/>
+        </w:rPr>
+        <w:t xml:space="preserve"> </w:t>
+      </w:r>
+      <w:r>
+        <w:rPr>
+          <w:lang w:val="en-GB"/>
+        </w:rPr>
+        <w:t>isn’t listening</w:t>
+      </w:r>
+      <w:r>
+        <w:rPr>
+          <w:lang w:val="en-GB"/>
+        </w:rPr>
+        <w:t>?</w:t>
       </w:r>
       <w:r>
         <w:rPr>
           <w:lang w:val="en-GB"/>
         </w:rPr>
         <w:t>”</w:t>
-      </w:r>
-    </w:p>
-    <w:p>
-      <w:pPr>
-        <w:rPr>
-          <w:lang w:val="en-GB"/>
-        </w:rPr>
-      </w:pPr>
-      <w:r>
-        <w:rPr>
-          <w:lang w:val="en-GB"/>
-        </w:rPr>
-        <w:t xml:space="preserve">I think whoever </w:t>
-      </w:r>
-      <w:proofErr w:type="spellStart"/>
-      <w:r>
-        <w:rPr>
-          <w:lang w:val="en-GB"/>
-        </w:rPr>
-        <w:t>Boht</w:t>
-      </w:r>
-      <w:proofErr w:type="spellEnd"/>
-      <w:r>
-        <w:rPr>
-          <w:lang w:val="en-GB"/>
-        </w:rPr>
-        <w:t xml:space="preserve"> was, he </w:t>
-      </w:r>
-      <w:r>
-        <w:rPr>
-          <w:lang w:val="en-GB"/>
-        </w:rPr>
-        <w:t>wanted people to think he might be Dobby – but they couldn’t prove it – and he wasn’t Dobby.</w:t>
-      </w:r>
-      <w:r>
-        <w:rPr>
-          <w:lang w:val="en-GB"/>
-        </w:rPr>
-        <w:t xml:space="preserve"> So</w:t>
-      </w:r>
-      <w:r>
-        <w:rPr>
-          <w:lang w:val="en-GB"/>
-        </w:rPr>
-        <w:t>,</w:t>
-      </w:r>
-      <w:r>
-        <w:rPr>
-          <w:lang w:val="en-GB"/>
-        </w:rPr>
-        <w:t xml:space="preserve"> if the rozzers ever</w:t>
-      </w:r>
-      <w:r>
-        <w:rPr>
-          <w:lang w:val="en-GB"/>
-        </w:rPr>
-        <w:t xml:space="preserve"> did</w:t>
-      </w:r>
-      <w:r>
-        <w:rPr>
-          <w:lang w:val="en-GB"/>
-        </w:rPr>
-        <w:t xml:space="preserve"> show up – his fingerprints would be wrong.</w:t>
-      </w:r>
-      <w:r>
-        <w:rPr>
-          <w:lang w:val="en-GB"/>
-        </w:rPr>
-        <w:t xml:space="preserve"> That’s what you and Astrid thought, isn’t it?</w:t>
-      </w:r>
-      <w:r>
-        <w:rPr>
-          <w:lang w:val="en-GB"/>
-        </w:rPr>
-        <w:t>”</w:t>
-      </w:r>
-    </w:p>
-    <w:p>
-      <w:pPr>
-        <w:rPr>
-          <w:lang w:val="en-GB"/>
-        </w:rPr>
-      </w:pPr>
-      <w:r>
-        <w:rPr>
-          <w:lang w:val="en-GB"/>
-        </w:rPr>
-        <w:t xml:space="preserve">There was more of the sound of Yan Pausing trying to regain control. Which sounded an awful lot like absolute silence. </w:t>
-      </w:r>
-      <w:r>
-        <w:rPr>
-          <w:lang w:val="en-GB"/>
-        </w:rPr>
-        <w:t>“</w:t>
-      </w:r>
-      <w:r>
-        <w:rPr>
-          <w:lang w:val="en-GB"/>
-        </w:rPr>
-        <w:t xml:space="preserve">Poor </w:t>
-      </w:r>
-      <w:r>
-        <w:rPr>
-          <w:lang w:val="en-GB"/>
-        </w:rPr>
-        <w:t>Dobby</w:t>
-      </w:r>
-      <w:r>
-        <w:rPr>
-          <w:lang w:val="en-GB"/>
-        </w:rPr>
-        <w:t xml:space="preserve">! </w:t>
-      </w:r>
-      <w:r>
-        <w:rPr>
-          <w:lang w:val="en-GB"/>
-        </w:rPr>
-        <w:t>Everybody assumed he’d done the perfect big score and disappeared.”</w:t>
-      </w:r>
-      <w:r>
-        <w:rPr>
-          <w:lang w:val="en-GB"/>
-        </w:rPr>
-        <w:br/>
-      </w:r>
-    </w:p>
-    <w:p>
-      <w:pPr>
-        <w:rPr>
-          <w:lang w:val="en-GB"/>
-        </w:rPr>
-      </w:pPr>
-      <w:r>
-        <w:rPr>
-          <w:lang w:val="en-GB"/>
-        </w:rPr>
-        <w:t>“Well, technically, that’s exactly what</w:t>
-      </w:r>
-      <w:r>
-        <w:rPr>
-          <w:lang w:val="en-GB"/>
-        </w:rPr>
-        <w:t xml:space="preserve"> he had done.”</w:t>
-      </w:r>
-    </w:p>
-    <w:p>
-      <w:pPr>
-        <w:rPr>
-          <w:lang w:val="en-GB"/>
-        </w:rPr>
-      </w:pPr>
-      <w:r>
-        <w:rPr>
-          <w:lang w:val="en-GB"/>
-        </w:rPr>
-        <w:t>“But somebody found him killed him, and then pretended to be him?”</w:t>
-      </w:r>
-    </w:p>
-    <w:p>
-      <w:pPr>
-        <w:rPr>
-          <w:lang w:val="en-GB"/>
-        </w:rPr>
-      </w:pPr>
-      <w:r>
-        <w:rPr>
-          <w:lang w:val="en-GB"/>
-        </w:rPr>
-        <w:t>“But if people thought he was Dobby, weren’t they going to come looking for him and the gold?”</w:t>
-      </w:r>
-    </w:p>
-    <w:p>
-      <w:pPr>
-        <w:rPr>
-          <w:lang w:val="en-GB"/>
-        </w:rPr>
-      </w:pPr>
-      <w:r>
-        <w:rPr>
-          <w:lang w:val="en-GB"/>
-        </w:rPr>
-        <w:t>“I think they did. I think lots of people came looking for the gold, but they never found it.</w:t>
-      </w:r>
-      <w:r>
-        <w:rPr>
-          <w:lang w:val="en-GB"/>
-        </w:rPr>
-        <w:t>”</w:t>
-      </w:r>
-    </w:p>
-    <w:p>
-      <w:pPr>
-        <w:rPr>
-          <w:lang w:val="en-GB"/>
-        </w:rPr>
-      </w:pPr>
-      <w:r>
-        <w:rPr>
-          <w:lang w:val="en-GB"/>
-        </w:rPr>
-        <w:t>“Like Terpsichore’s guys never found it.”</w:t>
-      </w:r>
-    </w:p>
-    <w:p>
-      <w:pPr>
-        <w:rPr>
-          <w:lang w:val="en-GB"/>
-        </w:rPr>
-      </w:pPr>
-      <w:r>
-        <w:rPr>
-          <w:lang w:val="en-GB"/>
-        </w:rPr>
-        <w:t xml:space="preserve">“Like Astrid’s guys never found it. Is there some point Yan when we’re </w:t>
-      </w:r>
-      <w:proofErr w:type="spellStart"/>
-      <w:r>
-        <w:rPr>
-          <w:lang w:val="en-GB"/>
-        </w:rPr>
-        <w:t>gong</w:t>
-      </w:r>
-      <w:proofErr w:type="spellEnd"/>
-      <w:r>
-        <w:rPr>
-          <w:lang w:val="en-GB"/>
-        </w:rPr>
-        <w:t xml:space="preserve"> to stop pretending that</w:t>
-      </w:r>
-      <w:r>
-        <w:rPr>
-          <w:lang w:val="en-GB"/>
-        </w:rPr>
-        <w:t xml:space="preserve"> she</w:t>
-      </w:r>
-      <w:r>
-        <w:rPr>
-          <w:lang w:val="en-GB"/>
-        </w:rPr>
-        <w:t xml:space="preserve"> </w:t>
-      </w:r>
-      <w:r>
-        <w:rPr>
-          <w:lang w:val="en-GB"/>
-        </w:rPr>
-        <w:t>isn’t listening.”</w:t>
       </w:r>
       <w:r>
         <w:rPr>
@@ -779,6 +958,7 @@
         <w:rPr>
           <w:lang w:val="en-GB"/>
         </w:rPr>
+        <w:lastRenderedPageBreak/>
         <w:t>“</w:t>
       </w:r>
       <w:r>
@@ -816,7 +996,6 @@
         <w:rPr>
           <w:lang w:val="en-GB"/>
         </w:rPr>
-        <w:lastRenderedPageBreak/>
         <w:t>“And of course fondue.”</w:t>
       </w:r>
       <w:r>
@@ -848,6 +1027,9 @@
     </w:p>
     <w:p>
       <w:pPr>
+        <w:pBdr>
+          <w:bottom w:val="single" w:sz="6" w:space="1" w:color="auto"/>
+        </w:pBdr>
         <w:rPr>
           <w:lang w:val="en-GB"/>
         </w:rPr>
@@ -857,6 +1039,63 @@
           <w:lang w:val="en-GB"/>
         </w:rPr>
         <w:t>“How did you…”</w:t>
+      </w:r>
+      <w:r>
+        <w:rPr>
+          <w:lang w:val="en-GB"/>
+        </w:rPr>
+        <w:br/>
+      </w:r>
+      <w:r>
+        <w:rPr>
+          <w:lang w:val="en-GB"/>
+        </w:rPr>
+        <w:t>“The white wine vinegar – it got delivered here by mistake.”</w:t>
+      </w:r>
+      <w:r>
+        <w:rPr>
+          <w:lang w:val="en-GB"/>
+        </w:rPr>
+        <w:br/>
+        <w:t>“Where</w:t>
+      </w:r>
+      <w:r>
+        <w:rPr>
+          <w:lang w:val="en-GB"/>
+        </w:rPr>
+        <w:t xml:space="preserve"> is </w:t>
+      </w:r>
+      <w:r>
+        <w:rPr>
+          <w:lang w:val="en-GB"/>
+        </w:rPr>
+        <w:t xml:space="preserve">the </w:t>
+      </w:r>
+      <w:proofErr w:type="gramStart"/>
+      <w:r>
+        <w:rPr>
+          <w:lang w:val="en-GB"/>
+        </w:rPr>
+        <w:t>gold</w:t>
+      </w:r>
+      <w:proofErr w:type="gramEnd"/>
+      <w:r>
+        <w:rPr>
+          <w:lang w:val="en-GB"/>
+        </w:rPr>
+        <w:t xml:space="preserve"> Ernie</w:t>
+      </w:r>
+      <w:r>
+        <w:rPr>
+          <w:lang w:val="en-GB"/>
+        </w:rPr>
+        <w:t>?</w:t>
+      </w:r>
+      <w:r>
+        <w:rPr>
+          <w:lang w:val="en-GB"/>
+        </w:rPr>
+        <w:t>”</w:t>
       </w:r>
       <w:r>
         <w:rPr>
@@ -869,14 +1108,487 @@
         <w:rPr>
           <w:lang w:val="en-GB"/>
         </w:rPr>
-        <w:t>I’m a detective.”</w:t>
+        <w:t>Maybe you can come round for tea, and I’ll show you. Bring biscuits</w:t>
+      </w:r>
+      <w:r>
+        <w:rPr>
+          <w:lang w:val="en-GB"/>
+        </w:rPr>
+        <w:t>, or and you might as well bring Maggie.”</w:t>
+      </w:r>
+    </w:p>
+    <w:p>
+      <w:pPr>
+        <w:rPr>
+          <w:lang w:val="en-GB"/>
+        </w:rPr>
+      </w:pPr>
+      <w:r>
+        <w:rPr>
+          <w:lang w:val="en-GB"/>
+        </w:rPr>
+        <w:t>“Where’s the gold Ernie</w:t>
+      </w:r>
+      <w:r>
+        <w:rPr>
+          <w:lang w:val="en-GB"/>
+        </w:rPr>
+        <w:t>?</w:t>
+      </w:r>
+      <w:r>
+        <w:rPr>
+          <w:lang w:val="en-GB"/>
+        </w:rPr>
+        <w:t>”</w:t>
       </w:r>
       <w:r>
         <w:rPr>
           <w:lang w:val="en-GB"/>
         </w:rPr>
         <w:br/>
-        <w:t>“Where’s the gold Ernie”</w:t>
+      </w:r>
+      <w:r>
+        <w:rPr>
+          <w:lang w:val="en-GB"/>
+        </w:rPr>
+        <w:t xml:space="preserve">There were all sitting in the middle of the maze. </w:t>
+      </w:r>
+      <w:r>
+        <w:rPr>
+          <w:lang w:val="en-GB"/>
+        </w:rPr>
+        <w:t>Klee was sitting</w:t>
+      </w:r>
+      <w:r>
+        <w:rPr>
+          <w:lang w:val="en-GB"/>
+        </w:rPr>
+        <w:t xml:space="preserve"> in the swivel chair that went with the desk. Yan was sitting in the wing-backed armchair. Astrid was sitting</w:t>
+      </w:r>
+      <w:r>
+        <w:rPr>
+          <w:lang w:val="en-GB"/>
+        </w:rPr>
+        <w:t xml:space="preserve"> upright on the edge of the chaise longue.</w:t>
+      </w:r>
+    </w:p>
+    <w:p>
+      <w:pPr>
+        <w:rPr>
+          <w:lang w:val="en-GB"/>
+        </w:rPr>
+      </w:pPr>
+      <w:r>
+        <w:rPr>
+          <w:lang w:val="en-GB"/>
+        </w:rPr>
+        <w:t>“</w:t>
+      </w:r>
+      <w:r>
+        <w:rPr>
+          <w:lang w:val="en-GB"/>
+        </w:rPr>
+        <w:t>Of course that’s what everybody w</w:t>
+      </w:r>
+      <w:r>
+        <w:rPr>
+          <w:lang w:val="en-GB"/>
+        </w:rPr>
+        <w:t>a</w:t>
+      </w:r>
+      <w:r>
+        <w:rPr>
+          <w:lang w:val="en-GB"/>
+        </w:rPr>
+        <w:t>nts to know.</w:t>
+      </w:r>
+      <w:r>
+        <w:rPr>
+          <w:lang w:val="en-GB"/>
+        </w:rPr>
+        <w:t xml:space="preserve"> </w:t>
+      </w:r>
+      <w:r>
+        <w:rPr>
+          <w:lang w:val="en-GB"/>
+        </w:rPr>
+        <w:t xml:space="preserve">And so, of course, people break in. </w:t>
+      </w:r>
+      <w:r>
+        <w:rPr>
+          <w:lang w:val="en-GB"/>
+        </w:rPr>
+        <w:t xml:space="preserve">They have a look </w:t>
+      </w:r>
+      <w:proofErr w:type="gramStart"/>
+      <w:r>
+        <w:rPr>
+          <w:lang w:val="en-GB"/>
+        </w:rPr>
+        <w:t>around,</w:t>
+      </w:r>
+      <w:proofErr w:type="gramEnd"/>
+      <w:r>
+        <w:rPr>
+          <w:lang w:val="en-GB"/>
+        </w:rPr>
+        <w:t xml:space="preserve"> they look for something shiny. They don’t find it. They leave</w:t>
+      </w:r>
+      <w:r>
+        <w:rPr>
+          <w:lang w:val="en-GB"/>
+        </w:rPr>
+        <w:t>.</w:t>
+      </w:r>
+      <w:r>
+        <w:rPr>
+          <w:lang w:val="en-GB"/>
+        </w:rPr>
+        <w:t xml:space="preserve"> Like your bozos did.”</w:t>
+      </w:r>
+    </w:p>
+    <w:p>
+      <w:pPr>
+        <w:rPr>
+          <w:lang w:val="en-GB"/>
+        </w:rPr>
+      </w:pPr>
+      <w:r>
+        <w:rPr>
+          <w:lang w:val="en-GB"/>
+        </w:rPr>
+        <w:t xml:space="preserve">Everybody else looked tired thought Klee. Klee himself, when he did get forgetful for a minute and catch himself in a mirror </w:t>
+      </w:r>
+      <w:proofErr w:type="gramStart"/>
+      <w:r>
+        <w:rPr>
+          <w:lang w:val="en-GB"/>
+        </w:rPr>
+        <w:t>definitely looked</w:t>
+      </w:r>
+      <w:proofErr w:type="gramEnd"/>
+      <w:r>
+        <w:rPr>
+          <w:lang w:val="en-GB"/>
+        </w:rPr>
+        <w:t xml:space="preserve"> his age. Pausing hadn’t got bald, and there was all that bullshit with the ultramarathons, which meant he was still stick thin, but his hair was fully grey now. It was only </w:t>
+      </w:r>
+      <w:r>
+        <w:rPr>
+          <w:lang w:val="en-GB"/>
+        </w:rPr>
+        <w:t xml:space="preserve">Maggie </w:t>
+      </w:r>
+      <w:r>
+        <w:rPr>
+          <w:lang w:val="en-GB"/>
+        </w:rPr>
+        <w:t xml:space="preserve">who </w:t>
+      </w:r>
+      <w:r>
+        <w:rPr>
+          <w:lang w:val="en-GB"/>
+        </w:rPr>
+        <w:t>looked</w:t>
+      </w:r>
+      <w:r>
+        <w:rPr>
+          <w:lang w:val="en-GB"/>
+        </w:rPr>
+        <w:t xml:space="preserve"> enthusiastic, youthful and positive. She looked at</w:t>
+      </w:r>
+      <w:r>
+        <w:rPr>
+          <w:lang w:val="en-GB"/>
+        </w:rPr>
+        <w:t xml:space="preserve"> Klee and wagged her tail</w:t>
+      </w:r>
+      <w:r>
+        <w:rPr>
+          <w:lang w:val="en-GB"/>
+        </w:rPr>
+        <w:t xml:space="preserve">. On the other </w:t>
+      </w:r>
+      <w:proofErr w:type="gramStart"/>
+      <w:r>
+        <w:rPr>
+          <w:lang w:val="en-GB"/>
+        </w:rPr>
+        <w:t>hand</w:t>
+      </w:r>
+      <w:proofErr w:type="gramEnd"/>
+      <w:r>
+        <w:rPr>
+          <w:lang w:val="en-GB"/>
+        </w:rPr>
+        <w:t xml:space="preserve"> </w:t>
+      </w:r>
+      <w:r>
+        <w:rPr>
+          <w:lang w:val="en-GB"/>
+        </w:rPr>
+        <w:t>Astrid</w:t>
+      </w:r>
+      <w:r>
+        <w:rPr>
+          <w:lang w:val="en-GB"/>
+        </w:rPr>
+        <w:t>, who Klee suspected was the only one of the four of them who had a skin care routine</w:t>
+      </w:r>
+      <w:r>
+        <w:rPr>
+          <w:lang w:val="en-GB"/>
+        </w:rPr>
+        <w:t xml:space="preserve"> looked a bit frayed around the edges. Maybe chasing villains around the world on behalf of Swiss Banks and insurance companies wasn’t the life-affirming elixir that – actually </w:t>
+      </w:r>
+      <w:proofErr w:type="spellStart"/>
+      <w:r>
+        <w:rPr>
+          <w:lang w:val="en-GB"/>
+        </w:rPr>
+        <w:t>no</w:t>
+      </w:r>
+      <w:proofErr w:type="spellEnd"/>
+      <w:r>
+        <w:rPr>
+          <w:lang w:val="en-GB"/>
+        </w:rPr>
+        <w:t xml:space="preserve"> one would imagine that was a good way of life. Maggie fixed him with here beautiful pale brown eyes – but </w:t>
+      </w:r>
+      <w:proofErr w:type="gramStart"/>
+      <w:r>
+        <w:rPr>
+          <w:lang w:val="en-GB"/>
+        </w:rPr>
+        <w:t xml:space="preserve">he </w:t>
+      </w:r>
+      <w:r>
+        <w:rPr>
+          <w:lang w:val="en-GB"/>
+        </w:rPr>
+        <w:t xml:space="preserve"> thought</w:t>
+      </w:r>
+      <w:proofErr w:type="gramEnd"/>
+      <w:r>
+        <w:rPr>
+          <w:lang w:val="en-GB"/>
+        </w:rPr>
+        <w:t xml:space="preserve"> </w:t>
+      </w:r>
+      <w:r>
+        <w:rPr>
+          <w:lang w:val="en-GB"/>
+        </w:rPr>
+        <w:t xml:space="preserve">Astrid </w:t>
+      </w:r>
+      <w:r>
+        <w:rPr>
+          <w:lang w:val="en-GB"/>
+        </w:rPr>
+        <w:t>might growl at him.</w:t>
+      </w:r>
+    </w:p>
+    <w:p>
+      <w:pPr>
+        <w:rPr>
+          <w:lang w:val="en-GB"/>
+        </w:rPr>
+      </w:pPr>
+      <w:r>
+        <w:rPr>
+          <w:lang w:val="en-GB"/>
+        </w:rPr>
+        <w:t xml:space="preserve">“That’s the genius of this place. And it was Dobby’s idea as </w:t>
+      </w:r>
+      <w:r>
+        <w:rPr>
+          <w:lang w:val="en-GB"/>
+        </w:rPr>
+        <w:t xml:space="preserve">far as I can see. </w:t>
+      </w:r>
+      <w:proofErr w:type="spellStart"/>
+      <w:r>
+        <w:rPr>
+          <w:lang w:val="en-GB"/>
+        </w:rPr>
+        <w:t>Boht</w:t>
+      </w:r>
+      <w:proofErr w:type="spellEnd"/>
+      <w:r>
+        <w:rPr>
+          <w:lang w:val="en-GB"/>
+        </w:rPr>
+        <w:t xml:space="preserve"> just inherited it.</w:t>
+      </w:r>
+      <w:r>
+        <w:rPr>
+          <w:lang w:val="en-GB"/>
+        </w:rPr>
+        <w:t>”</w:t>
+      </w:r>
+    </w:p>
+    <w:p>
+      <w:pPr>
+        <w:rPr>
+          <w:lang w:val="en-GB"/>
+        </w:rPr>
+      </w:pPr>
+      <w:r>
+        <w:rPr>
+          <w:lang w:val="en-GB"/>
+        </w:rPr>
+        <w:t>“Where’s the gold Ernie.”</w:t>
+      </w:r>
+    </w:p>
+    <w:p>
+      <w:pPr>
+        <w:rPr>
+          <w:lang w:val="en-GB"/>
+        </w:rPr>
+      </w:pPr>
+      <w:r>
+        <w:rPr>
+          <w:lang w:val="en-GB"/>
+        </w:rPr>
+        <w:t>“All these art deco bronzes? They’re fake.”</w:t>
+      </w:r>
+    </w:p>
+    <w:p>
+      <w:pPr>
+        <w:rPr>
+          <w:lang w:val="en-GB"/>
+        </w:rPr>
+      </w:pPr>
+      <w:r>
+        <w:rPr>
+          <w:lang w:val="en-GB"/>
+        </w:rPr>
+        <w:t>“How do you know they’re fake”</w:t>
+      </w:r>
+    </w:p>
+    <w:p>
+      <w:pPr>
+        <w:rPr>
+          <w:lang w:val="en-GB"/>
+        </w:rPr>
+      </w:pPr>
+      <w:r>
+        <w:rPr>
+          <w:lang w:val="en-GB"/>
+        </w:rPr>
+        <w:t>“They’re too heavy. They’re not made of bronze.</w:t>
+      </w:r>
+      <w:r>
+        <w:rPr>
+          <w:lang w:val="en-GB"/>
+        </w:rPr>
+        <w:t xml:space="preserve"> They’re made of…</w:t>
+      </w:r>
+      <w:r>
+        <w:rPr>
+          <w:lang w:val="en-GB"/>
+        </w:rPr>
+        <w:t xml:space="preserve"> </w:t>
+      </w:r>
+      <w:r>
+        <w:rPr>
+          <w:lang w:val="en-GB"/>
+        </w:rPr>
+        <w:t>Gold</w:t>
+      </w:r>
+      <w:r>
+        <w:rPr>
+          <w:lang w:val="en-GB"/>
+        </w:rPr>
+        <w:t>!</w:t>
+      </w:r>
+    </w:p>
+    <w:p>
+      <w:pPr>
+        <w:rPr>
+          <w:lang w:val="en-GB"/>
+        </w:rPr>
+      </w:pPr>
+      <w:r>
+        <w:rPr>
+          <w:lang w:val="en-GB"/>
+        </w:rPr>
+        <w:lastRenderedPageBreak/>
+        <w:t>“And the fire extinguis</w:t>
+      </w:r>
+      <w:r>
+        <w:rPr>
+          <w:lang w:val="en-GB"/>
+        </w:rPr>
+        <w:t>h</w:t>
+      </w:r>
+      <w:r>
+        <w:rPr>
+          <w:lang w:val="en-GB"/>
+        </w:rPr>
+        <w:t>ers?</w:t>
+      </w:r>
+      <w:r>
+        <w:rPr>
+          <w:lang w:val="en-GB"/>
+        </w:rPr>
+        <w:t xml:space="preserve"> </w:t>
+      </w:r>
+      <w:r>
+        <w:rPr>
+          <w:lang w:val="en-GB"/>
+        </w:rPr>
+        <w:t>Gold.”</w:t>
+      </w:r>
+      <w:r>
+        <w:rPr>
+          <w:lang w:val="en-GB"/>
+        </w:rPr>
+        <w:br/>
+        <w:t xml:space="preserve">“And the bricks and that keep </w:t>
+      </w:r>
+      <w:r>
+        <w:rPr>
+          <w:lang w:val="en-GB"/>
+        </w:rPr>
+        <w:t>the protective mesh in place to preserve the rare books?”</w:t>
+      </w:r>
+      <w:r>
+        <w:rPr>
+          <w:lang w:val="en-GB"/>
+        </w:rPr>
+        <w:t xml:space="preserve"> </w:t>
+      </w:r>
+      <w:r>
+        <w:rPr>
+          <w:lang w:val="en-GB"/>
+        </w:rPr>
+        <w:t>Gold</w:t>
+      </w:r>
+      <w:r>
+        <w:rPr>
+          <w:lang w:val="en-GB"/>
+        </w:rPr>
+        <w:t>!</w:t>
+      </w:r>
+      <w:r>
+        <w:rPr>
+          <w:lang w:val="en-GB"/>
+        </w:rPr>
+        <w:t xml:space="preserve"> And this, of course presents us with another problem.”</w:t>
+      </w:r>
+    </w:p>
+    <w:p>
+      <w:pPr>
+        <w:rPr>
+          <w:lang w:val="en-GB"/>
+        </w:rPr>
+      </w:pPr>
+      <w:r>
+        <w:rPr>
+          <w:lang w:val="en-GB"/>
+        </w:rPr>
+        <w:t>“Hang on a minute! That can’t be right!”</w:t>
       </w:r>
       <w:r>
         <w:rPr>
@@ -889,455 +1601,138 @@
         <w:rPr>
           <w:lang w:val="en-GB"/>
         </w:rPr>
-        <w:t>Maybe you can come round for tea, and I’ll show you. Bring biscuits</w:t>
-      </w:r>
-      <w:r>
-        <w:rPr>
-          <w:lang w:val="en-GB"/>
-        </w:rPr>
-        <w:t>, or and you might as well bring Maggie.”</w:t>
-      </w:r>
-    </w:p>
-    <w:p>
-      <w:pPr>
-        <w:rPr>
-          <w:lang w:val="en-GB"/>
-        </w:rPr>
-      </w:pPr>
-      <w:r>
-        <w:rPr>
-          <w:lang w:val="en-GB"/>
-        </w:rPr>
-        <w:t>“Where’s the gold Ernie</w:t>
-      </w:r>
-      <w:r>
-        <w:rPr>
-          <w:lang w:val="en-GB"/>
-        </w:rPr>
-        <w:t>?</w:t>
-      </w:r>
-      <w:r>
-        <w:rPr>
-          <w:lang w:val="en-GB"/>
-        </w:rPr>
-        <w:t>”</w:t>
+        <w:t xml:space="preserve">It is right. </w:t>
+      </w:r>
+      <w:r>
+        <w:rPr>
+          <w:lang w:val="en-GB"/>
+        </w:rPr>
+        <w:t>There’s too much gold.</w:t>
+      </w:r>
+      <w:r>
+        <w:rPr>
+          <w:lang w:val="en-GB"/>
+        </w:rPr>
+        <w:t xml:space="preserve"> Too much gold for </w:t>
+      </w:r>
+      <w:proofErr w:type="spellStart"/>
+      <w:r>
+        <w:rPr>
+          <w:lang w:val="en-GB"/>
+        </w:rPr>
+        <w:t>Collaign</w:t>
+      </w:r>
+      <w:proofErr w:type="spellEnd"/>
+      <w:r>
+        <w:rPr>
+          <w:lang w:val="en-GB"/>
+        </w:rPr>
+        <w:t xml:space="preserve">-Schotts. I looked it up. Too much gold for </w:t>
+      </w:r>
+      <w:proofErr w:type="spellStart"/>
+      <w:r>
+        <w:rPr>
+          <w:lang w:val="en-GB"/>
+        </w:rPr>
+        <w:t>Collaign</w:t>
+      </w:r>
+      <w:proofErr w:type="spellEnd"/>
+      <w:r>
+        <w:rPr>
+          <w:lang w:val="en-GB"/>
+        </w:rPr>
+        <w:t>-Schotts</w:t>
+      </w:r>
+      <w:r>
+        <w:rPr>
+          <w:lang w:val="en-GB"/>
+        </w:rPr>
+        <w:t>, too much gold for the last 10 major thefts of gold going back 20 years. Too. Much. gold.”</w:t>
+      </w:r>
+    </w:p>
+    <w:p>
+      <w:pPr>
+        <w:rPr>
+          <w:lang w:val="en-GB"/>
+        </w:rPr>
+      </w:pPr>
+      <w:r>
+        <w:rPr>
+          <w:lang w:val="en-GB"/>
+        </w:rPr>
+        <w:t xml:space="preserve">“Don’t you worry your pretty little head about </w:t>
+      </w:r>
+      <w:proofErr w:type="gramStart"/>
+      <w:r>
+        <w:rPr>
+          <w:lang w:val="en-GB"/>
+        </w:rPr>
+        <w:t>it</w:t>
+      </w:r>
+      <w:proofErr w:type="gramEnd"/>
+      <w:r>
+        <w:rPr>
+          <w:lang w:val="en-GB"/>
+        </w:rPr>
+        <w:t xml:space="preserve"> Klee.” </w:t>
+      </w:r>
+    </w:p>
+    <w:p>
+      <w:pPr>
+        <w:rPr>
+          <w:lang w:val="en-GB"/>
+        </w:rPr>
+      </w:pPr>
+      <w:r>
+        <w:rPr>
+          <w:lang w:val="en-GB"/>
+        </w:rPr>
+        <w:t>“Oh my God! Denny Bracks!”</w:t>
+      </w:r>
+    </w:p>
+    <w:p>
+      <w:pPr>
+        <w:rPr>
+          <w:lang w:val="en-GB"/>
+        </w:rPr>
+      </w:pPr>
+      <w:r>
+        <w:rPr>
+          <w:lang w:val="en-GB"/>
+        </w:rPr>
+        <w:t>“I was wondering about that. Is some of this gold yours Denny?”</w:t>
+      </w:r>
+    </w:p>
+    <w:p>
+      <w:pPr>
+        <w:rPr>
+          <w:lang w:val="en-GB"/>
+        </w:rPr>
+      </w:pPr>
+      <w:r>
+        <w:rPr>
+          <w:lang w:val="en-GB"/>
+        </w:rPr>
+        <w:t>“It’s all mine now Klee.”</w:t>
       </w:r>
       <w:r>
         <w:rPr>
           <w:lang w:val="en-GB"/>
         </w:rPr>
         <w:br/>
-      </w:r>
-      <w:r>
-        <w:rPr>
-          <w:lang w:val="en-GB"/>
-        </w:rPr>
-        <w:t xml:space="preserve">There were all sitting in the middle of the maze. </w:t>
-      </w:r>
-      <w:r>
-        <w:rPr>
-          <w:lang w:val="en-GB"/>
-        </w:rPr>
-        <w:t>Klee was sitting</w:t>
-      </w:r>
-      <w:r>
-        <w:rPr>
-          <w:lang w:val="en-GB"/>
-        </w:rPr>
-        <w:t xml:space="preserve"> in the swivel chair that went with the desk. Yan was sitting in the wing-backed armchair. Astrid was sitting</w:t>
-      </w:r>
-      <w:r>
-        <w:rPr>
-          <w:lang w:val="en-GB"/>
-        </w:rPr>
-        <w:t xml:space="preserve"> upright on the edge of the chaise longue.</w:t>
-      </w:r>
-    </w:p>
-    <w:p>
-      <w:pPr>
-        <w:rPr>
-          <w:lang w:val="en-GB"/>
-        </w:rPr>
-      </w:pPr>
-      <w:r>
-        <w:rPr>
-          <w:lang w:val="en-GB"/>
-        </w:rPr>
-        <w:t>“</w:t>
-      </w:r>
-      <w:r>
-        <w:rPr>
-          <w:lang w:val="en-GB"/>
-        </w:rPr>
-        <w:t>Of course that’s what everybody w</w:t>
-      </w:r>
-      <w:r>
-        <w:rPr>
-          <w:lang w:val="en-GB"/>
-        </w:rPr>
-        <w:t>a</w:t>
-      </w:r>
-      <w:r>
-        <w:rPr>
-          <w:lang w:val="en-GB"/>
-        </w:rPr>
-        <w:t>nts to know.</w:t>
-      </w:r>
-      <w:r>
-        <w:rPr>
-          <w:lang w:val="en-GB"/>
-        </w:rPr>
-        <w:t>”</w:t>
-      </w:r>
-    </w:p>
-    <w:p>
-      <w:pPr>
-        <w:rPr>
-          <w:lang w:val="en-GB"/>
-        </w:rPr>
-      </w:pPr>
-      <w:r>
-        <w:rPr>
-          <w:lang w:val="en-GB"/>
-        </w:rPr>
-        <w:t>“</w:t>
-      </w:r>
-      <w:r>
-        <w:rPr>
-          <w:lang w:val="en-GB"/>
-        </w:rPr>
-        <w:t xml:space="preserve">And so, of course, people break in. </w:t>
-      </w:r>
-      <w:r>
-        <w:rPr>
-          <w:lang w:val="en-GB"/>
-        </w:rPr>
-        <w:t>They have a look around, they look for something shiny. They don’t find it. They leave</w:t>
-      </w:r>
-      <w:r>
-        <w:rPr>
-          <w:lang w:val="en-GB"/>
-        </w:rPr>
-        <w:t>.</w:t>
-      </w:r>
-      <w:r>
-        <w:rPr>
-          <w:lang w:val="en-GB"/>
-        </w:rPr>
-        <w:t xml:space="preserve"> Like your bozos did.”</w:t>
-      </w:r>
-    </w:p>
-    <w:p>
-      <w:pPr>
-        <w:rPr>
-          <w:lang w:val="en-GB"/>
-        </w:rPr>
-      </w:pPr>
-      <w:r>
-        <w:rPr>
-          <w:lang w:val="en-GB"/>
-        </w:rPr>
-        <w:t xml:space="preserve">Maggie looked at Klee and wagged her tail, it was </w:t>
-      </w:r>
-      <w:r>
-        <w:rPr>
-          <w:lang w:val="en-GB"/>
-        </w:rPr>
-        <w:t>Astrid who he thought might growl at him.</w:t>
-      </w:r>
-    </w:p>
-    <w:p>
-      <w:pPr>
-        <w:rPr>
-          <w:lang w:val="en-GB"/>
-        </w:rPr>
-      </w:pPr>
-      <w:r>
-        <w:rPr>
-          <w:lang w:val="en-GB"/>
-        </w:rPr>
-        <w:t xml:space="preserve">“That’s the genius of this place. And it was Dobby’s idea as </w:t>
-      </w:r>
-      <w:r>
-        <w:rPr>
-          <w:lang w:val="en-GB"/>
-        </w:rPr>
-        <w:t xml:space="preserve">far as I can see. </w:t>
-      </w:r>
-      <w:proofErr w:type="spellStart"/>
-      <w:r>
-        <w:rPr>
-          <w:lang w:val="en-GB"/>
-        </w:rPr>
-        <w:t>Boht</w:t>
-      </w:r>
-      <w:proofErr w:type="spellEnd"/>
-      <w:r>
-        <w:rPr>
-          <w:lang w:val="en-GB"/>
-        </w:rPr>
-        <w:t xml:space="preserve"> just inherited it.</w:t>
-      </w:r>
-      <w:r>
-        <w:rPr>
-          <w:lang w:val="en-GB"/>
-        </w:rPr>
-        <w:t>”</w:t>
-      </w:r>
-    </w:p>
-    <w:p>
-      <w:pPr>
-        <w:rPr>
-          <w:lang w:val="en-GB"/>
-        </w:rPr>
-      </w:pPr>
-      <w:r>
-        <w:rPr>
-          <w:lang w:val="en-GB"/>
-        </w:rPr>
-        <w:t>“Where’s the gold Ernie.”</w:t>
-      </w:r>
-    </w:p>
-    <w:p>
-      <w:pPr>
-        <w:rPr>
-          <w:lang w:val="en-GB"/>
-        </w:rPr>
-      </w:pPr>
-      <w:r>
-        <w:rPr>
-          <w:lang w:val="en-GB"/>
-        </w:rPr>
-        <w:t>“All these art deco bronzes? They’re fake.”</w:t>
-      </w:r>
-    </w:p>
-    <w:p>
-      <w:pPr>
-        <w:rPr>
-          <w:lang w:val="en-GB"/>
-        </w:rPr>
-      </w:pPr>
-      <w:r>
-        <w:rPr>
-          <w:lang w:val="en-GB"/>
-        </w:rPr>
-        <w:t>“How do you know they’re fake”</w:t>
-      </w:r>
-    </w:p>
-    <w:p>
-      <w:pPr>
-        <w:rPr>
-          <w:lang w:val="en-GB"/>
-        </w:rPr>
-      </w:pPr>
-      <w:r>
-        <w:rPr>
-          <w:lang w:val="en-GB"/>
-        </w:rPr>
-        <w:t>“They’re too heavy. They’re not made of bronze.</w:t>
-      </w:r>
-      <w:r>
-        <w:rPr>
-          <w:lang w:val="en-GB"/>
-        </w:rPr>
-        <w:t xml:space="preserve"> They’re made of…”</w:t>
-      </w:r>
-      <w:r>
-        <w:rPr>
-          <w:lang w:val="en-GB"/>
-        </w:rPr>
-        <w:br/>
-        <w:t>“Gold.”</w:t>
-      </w:r>
-    </w:p>
-    <w:p>
-      <w:pPr>
-        <w:rPr>
-          <w:lang w:val="en-GB"/>
-        </w:rPr>
-      </w:pPr>
-      <w:r>
-        <w:rPr>
-          <w:lang w:val="en-GB"/>
-        </w:rPr>
-        <w:t>“And the fire extinguis</w:t>
-      </w:r>
-      <w:r>
-        <w:rPr>
-          <w:lang w:val="en-GB"/>
-        </w:rPr>
-        <w:t>h</w:t>
-      </w:r>
-      <w:r>
-        <w:rPr>
-          <w:lang w:val="en-GB"/>
-        </w:rPr>
-        <w:t>ers?”</w:t>
-      </w:r>
-      <w:r>
-        <w:rPr>
-          <w:lang w:val="en-GB"/>
-        </w:rPr>
-        <w:br/>
-        <w:t>“Gold.”</w:t>
-      </w:r>
-      <w:r>
-        <w:rPr>
-          <w:lang w:val="en-GB"/>
-        </w:rPr>
-        <w:br/>
-        <w:t xml:space="preserve">“And the bricks and that keep </w:t>
-      </w:r>
-      <w:r>
-        <w:rPr>
-          <w:lang w:val="en-GB"/>
-        </w:rPr>
-        <w:t>the protective mesh in place to preserve the rare books?”</w:t>
-      </w:r>
-      <w:r>
-        <w:rPr>
-          <w:lang w:val="en-GB"/>
-        </w:rPr>
-        <w:br/>
-        <w:t>“Gold.</w:t>
-      </w:r>
-      <w:r>
-        <w:rPr>
-          <w:lang w:val="en-GB"/>
-        </w:rPr>
-        <w:t xml:space="preserve"> And this, of course presents us with another problem.”</w:t>
-      </w:r>
-    </w:p>
-    <w:p>
-      <w:pPr>
-        <w:rPr>
-          <w:lang w:val="en-GB"/>
-        </w:rPr>
-      </w:pPr>
-      <w:r>
-        <w:rPr>
-          <w:lang w:val="en-GB"/>
-        </w:rPr>
-        <w:t>“Hang on a minute! That can’t be right!”</w:t>
-      </w:r>
-      <w:r>
-        <w:rPr>
-          <w:lang w:val="en-GB"/>
-        </w:rPr>
-        <w:br/>
-        <w:t>“</w:t>
-      </w:r>
-      <w:r>
-        <w:rPr>
-          <w:lang w:val="en-GB"/>
-        </w:rPr>
-        <w:t xml:space="preserve">It is right. </w:t>
-      </w:r>
-      <w:r>
-        <w:rPr>
-          <w:lang w:val="en-GB"/>
-        </w:rPr>
-        <w:t>There’s too much gold.</w:t>
-      </w:r>
-      <w:r>
-        <w:rPr>
-          <w:lang w:val="en-GB"/>
-        </w:rPr>
-        <w:t xml:space="preserve"> Too much gold for </w:t>
-      </w:r>
-      <w:proofErr w:type="spellStart"/>
-      <w:r>
-        <w:rPr>
-          <w:lang w:val="en-GB"/>
-        </w:rPr>
-        <w:t>Collaign</w:t>
-      </w:r>
-      <w:proofErr w:type="spellEnd"/>
-      <w:r>
-        <w:rPr>
-          <w:lang w:val="en-GB"/>
-        </w:rPr>
-        <w:t xml:space="preserve">-Schotts. I looked it up. Too much gold for </w:t>
-      </w:r>
-      <w:proofErr w:type="spellStart"/>
-      <w:r>
-        <w:rPr>
-          <w:lang w:val="en-GB"/>
-        </w:rPr>
-        <w:t>Collaign</w:t>
-      </w:r>
-      <w:proofErr w:type="spellEnd"/>
-      <w:r>
-        <w:rPr>
-          <w:lang w:val="en-GB"/>
-        </w:rPr>
-        <w:t>-Schotts</w:t>
-      </w:r>
-      <w:r>
-        <w:rPr>
-          <w:lang w:val="en-GB"/>
-        </w:rPr>
-        <w:t>, too much gold for the last 10 majors thefts of gold going back 20 years. Too. Much. gold.”</w:t>
-      </w:r>
-    </w:p>
-    <w:p>
-      <w:pPr>
-        <w:rPr>
-          <w:lang w:val="en-GB"/>
-        </w:rPr>
-      </w:pPr>
-      <w:r>
-        <w:rPr>
-          <w:lang w:val="en-GB"/>
-        </w:rPr>
-        <w:t xml:space="preserve">“Don’t you worry your pretty little head about it Klee.” </w:t>
-      </w:r>
-    </w:p>
-    <w:p>
-      <w:pPr>
-        <w:rPr>
-          <w:lang w:val="en-GB"/>
-        </w:rPr>
-      </w:pPr>
-      <w:r>
-        <w:rPr>
-          <w:lang w:val="en-GB"/>
-        </w:rPr>
-        <w:lastRenderedPageBreak/>
-        <w:t>“Oh my God! Denny Bracks!”</w:t>
-      </w:r>
-    </w:p>
-    <w:p>
-      <w:pPr>
-        <w:rPr>
-          <w:lang w:val="en-GB"/>
-        </w:rPr>
-      </w:pPr>
-      <w:r>
-        <w:rPr>
-          <w:lang w:val="en-GB"/>
-        </w:rPr>
-        <w:t>“I was wondering about that. Is some of this gold yours Denny?”</w:t>
-      </w:r>
-    </w:p>
-    <w:p>
-      <w:pPr>
-        <w:rPr>
-          <w:lang w:val="en-GB"/>
-        </w:rPr>
-      </w:pPr>
-      <w:r>
-        <w:rPr>
-          <w:lang w:val="en-GB"/>
-        </w:rPr>
-        <w:t>“It’s all mine now Klee.”</w:t>
-      </w:r>
-      <w:r>
-        <w:rPr>
-          <w:lang w:val="en-GB"/>
-        </w:rPr>
-        <w:br/>
-        <w:t>“But – was some of it – originally yours? Before you nicked it from that bank obviously.”</w:t>
+        <w:t xml:space="preserve">“But – was some of it – originally yours? </w:t>
+      </w:r>
+      <w:r>
+        <w:rPr>
+          <w:lang w:val="en-GB"/>
+        </w:rPr>
+        <w:t>Not b</w:t>
+      </w:r>
+      <w:r>
+        <w:rPr>
+          <w:lang w:val="en-GB"/>
+        </w:rPr>
+        <w:t>efore you nicked it from that bank obviously.”</w:t>
       </w:r>
       <w:r>
         <w:rPr>
@@ -1368,6 +1763,7 @@
         <w:t xml:space="preserve">“Oh! And you’re Lenny Bracks! The international gold thief who went to university. Did you really do a </w:t>
       </w:r>
       <w:proofErr w:type="spellStart"/>
+      <w:proofErr w:type="gramStart"/>
       <w:r>
         <w:rPr>
           <w:lang w:val="en-GB"/>
@@ -1375,6 +1771,7 @@
         <w:t>Masters</w:t>
       </w:r>
       <w:proofErr w:type="spellEnd"/>
+      <w:proofErr w:type="gramEnd"/>
       <w:r>
         <w:rPr>
           <w:lang w:val="en-GB"/>
@@ -1424,34 +1821,52 @@
         <w:rPr>
           <w:lang w:val="en-GB"/>
         </w:rPr>
-        <w:t>“We came in quietly. Congratulations by the way on your new security system. It’s state of the art, must have set someone back a tidy sum  – it took my boy three or four minutes to turn it off.”</w:t>
-      </w:r>
-    </w:p>
-    <w:p>
-      <w:pPr>
-        <w:rPr>
-          <w:lang w:val="en-GB"/>
-        </w:rPr>
-      </w:pPr>
-      <w:r>
-        <w:rPr>
-          <w:lang w:val="en-GB"/>
-        </w:rPr>
-        <w:t xml:space="preserve">Here’s the weird thing about sitting in the middle of a bi </w:t>
-      </w:r>
-      <w:proofErr w:type="spellStart"/>
-      <w:r>
-        <w:rPr>
-          <w:lang w:val="en-GB"/>
-        </w:rPr>
-        <w:t>cursal</w:t>
-      </w:r>
-      <w:proofErr w:type="spellEnd"/>
-      <w:r>
-        <w:rPr>
-          <w:lang w:val="en-GB"/>
-        </w:rPr>
-        <w:t xml:space="preserve"> maze – if somebody breaks down the door – you can hear them. But there’s no straight forward way to rush to meet them. </w:t>
+        <w:t xml:space="preserve">“We came in quietly. Congratulations </w:t>
+      </w:r>
+      <w:proofErr w:type="gramStart"/>
+      <w:r>
+        <w:rPr>
+          <w:lang w:val="en-GB"/>
+        </w:rPr>
+        <w:t>by the way on</w:t>
+      </w:r>
+      <w:proofErr w:type="gramEnd"/>
+      <w:r>
+        <w:rPr>
+          <w:lang w:val="en-GB"/>
+        </w:rPr>
+        <w:t xml:space="preserve"> your new security system. It’s state of the art, must have set someone back a tidy sum – it took my boy three or four minutes to turn it off.”</w:t>
+      </w:r>
+    </w:p>
+    <w:p>
+      <w:pPr>
+        <w:rPr>
+          <w:lang w:val="en-GB"/>
+        </w:rPr>
+      </w:pPr>
+      <w:r>
+        <w:rPr>
+          <w:lang w:val="en-GB"/>
+        </w:rPr>
+        <w:t>Here’s the weird thing about sitting in the middle of a bicursal maze – if somebody breaks down the door – you can hear them. But there’s no straight</w:t>
+      </w:r>
+      <w:r>
+        <w:rPr>
+          <w:lang w:val="en-GB"/>
+        </w:rPr>
+        <w:t>-</w:t>
+      </w:r>
+      <w:r>
+        <w:rPr>
+          <w:lang w:val="en-GB"/>
+        </w:rPr>
+        <w:t xml:space="preserve"> forward way to rush to meet them. </w:t>
+      </w:r>
+      <w:r>
+        <w:rPr>
+          <w:lang w:val="en-GB"/>
+        </w:rPr>
+        <w:t>Because the chances are that you aren’t going to meet them coming in.</w:t>
       </w:r>
     </w:p>
     <w:p>
@@ -1515,13 +1930,28 @@
         <w:rPr>
           <w:lang w:val="en-GB"/>
         </w:rPr>
+        <w:lastRenderedPageBreak/>
         <w:t>I’ve got chairs for everyone, thought Klee – but they’re back in the chapel.</w:t>
       </w:r>
       <w:r>
         <w:rPr>
           <w:lang w:val="en-GB"/>
         </w:rPr>
-        <w:t xml:space="preserve"> And anyway none of the people with guns are probably going to want to sit down.</w:t>
+        <w:t xml:space="preserve"> And </w:t>
+      </w:r>
+      <w:proofErr w:type="gramStart"/>
+      <w:r>
+        <w:rPr>
+          <w:lang w:val="en-GB"/>
+        </w:rPr>
+        <w:t>anyway</w:t>
+      </w:r>
+      <w:proofErr w:type="gramEnd"/>
+      <w:r>
+        <w:rPr>
+          <w:lang w:val="en-GB"/>
+        </w:rPr>
+        <w:t xml:space="preserve"> none of the people with guns are probably going to want to sit down.</w:t>
       </w:r>
     </w:p>
     <w:p>
@@ -1599,269 +2029,289 @@
         <w:rPr>
           <w:lang w:val="en-GB"/>
         </w:rPr>
+        <w:t>In suspicious circumstances</w:t>
+      </w:r>
+      <w:r>
+        <w:rPr>
+          <w:lang w:val="en-GB"/>
+        </w:rPr>
+        <w:t xml:space="preserve"> – supposition.</w:t>
+      </w:r>
+      <w:r>
+        <w:rPr>
+          <w:lang w:val="en-GB"/>
+        </w:rPr>
+        <w:t xml:space="preserve"> </w:t>
+      </w:r>
+    </w:p>
+    <w:p>
+      <w:pPr>
+        <w:rPr>
+          <w:lang w:val="en-GB"/>
+        </w:rPr>
+      </w:pPr>
+      <w:r>
+        <w:rPr>
+          <w:lang w:val="en-GB"/>
+        </w:rPr>
+        <w:t xml:space="preserve">The police say it’s a suicide – fact. </w:t>
+      </w:r>
+    </w:p>
+    <w:p>
+      <w:pPr>
+        <w:rPr>
+          <w:lang w:val="en-GB"/>
+        </w:rPr>
+      </w:pPr>
+      <w:r>
+        <w:rPr>
+          <w:lang w:val="en-GB"/>
+        </w:rPr>
+        <w:t xml:space="preserve">My car blows up – fact. I’m not in it – fact. </w:t>
+      </w:r>
+    </w:p>
+    <w:p>
+      <w:pPr>
+        <w:rPr>
+          <w:lang w:val="en-GB"/>
+        </w:rPr>
+      </w:pPr>
+      <w:r>
+        <w:rPr>
+          <w:lang w:val="en-GB"/>
+        </w:rPr>
+        <w:t>S</w:t>
+      </w:r>
+      <w:r>
+        <w:rPr>
+          <w:lang w:val="en-GB"/>
+        </w:rPr>
+        <w:t>omeone hoped I would be</w:t>
+      </w:r>
+      <w:r>
+        <w:rPr>
+          <w:lang w:val="en-GB"/>
+        </w:rPr>
+        <w:t xml:space="preserve"> in it</w:t>
+      </w:r>
+      <w:r>
+        <w:rPr>
+          <w:lang w:val="en-GB"/>
+        </w:rPr>
+        <w:t xml:space="preserve"> – </w:t>
+      </w:r>
+      <w:r>
+        <w:rPr>
+          <w:lang w:val="en-GB"/>
+        </w:rPr>
+        <w:t>supposition.</w:t>
+      </w:r>
+    </w:p>
+    <w:p>
+      <w:pPr>
+        <w:rPr>
+          <w:lang w:val="en-GB"/>
+        </w:rPr>
+      </w:pPr>
+      <w:r>
+        <w:rPr>
+          <w:lang w:val="en-GB"/>
+        </w:rPr>
+        <w:t>I’m in a tricky situation – fact. I’m literally in the gutter with an old lady who feeds the pigeons – fact.</w:t>
+      </w:r>
+    </w:p>
+    <w:p>
+      <w:pPr>
+        <w:rPr>
+          <w:lang w:val="en-GB"/>
+        </w:rPr>
+      </w:pPr>
+      <w:r>
+        <w:rPr>
+          <w:lang w:val="en-GB"/>
+        </w:rPr>
+        <w:t>Jan Pausing is my friend – turns out that was just a supposition.</w:t>
+      </w:r>
+    </w:p>
+    <w:p>
+      <w:pPr>
+        <w:rPr>
+          <w:lang w:val="en-GB"/>
+        </w:rPr>
+      </w:pPr>
+      <w:r>
+        <w:rPr>
+          <w:lang w:val="en-GB"/>
+        </w:rPr>
+        <w:t>He suggests I do a job for him as a live-in guardian – fact.</w:t>
+      </w:r>
+    </w:p>
+    <w:p>
+      <w:pPr>
+        <w:rPr>
+          <w:lang w:val="en-GB"/>
+        </w:rPr>
+      </w:pPr>
+      <w:r>
+        <w:rPr>
+          <w:lang w:val="en-GB"/>
+        </w:rPr>
+        <w:t>I believe him when he says it will be an opportunity to lay low – fact.</w:t>
+      </w:r>
+    </w:p>
+    <w:p>
+      <w:pPr>
+        <w:rPr>
+          <w:lang w:val="en-GB"/>
+        </w:rPr>
+      </w:pPr>
+      <w:r>
+        <w:rPr>
+          <w:lang w:val="en-GB"/>
+        </w:rPr>
+        <w:t>I am an utter moron</w:t>
+      </w:r>
+      <w:r>
+        <w:rPr>
+          <w:lang w:val="en-GB"/>
+        </w:rPr>
+        <w:t xml:space="preserve"> who’s easily fooled</w:t>
+      </w:r>
+      <w:r>
+        <w:rPr>
+          <w:lang w:val="en-GB"/>
+        </w:rPr>
+        <w:t xml:space="preserve"> – well, it’s not a supposition.</w:t>
+      </w:r>
+    </w:p>
+    <w:p>
+      <w:pPr>
+        <w:rPr>
+          <w:lang w:val="en-GB"/>
+        </w:rPr>
+      </w:pPr>
+      <w:r>
+        <w:rPr>
+          <w:lang w:val="en-GB"/>
+        </w:rPr>
+        <w:t>My car is a bit – well, easy to spot – fact.</w:t>
+      </w:r>
+    </w:p>
+    <w:p>
+      <w:pPr>
+        <w:rPr>
+          <w:lang w:val="en-GB"/>
+        </w:rPr>
+      </w:pPr>
+      <w:r>
+        <w:rPr>
+          <w:lang w:val="en-GB"/>
+        </w:rPr>
+        <w:t>And I notice the garage is empty – fact.</w:t>
+      </w:r>
+    </w:p>
+    <w:p>
+      <w:pPr>
+        <w:rPr>
+          <w:lang w:val="en-GB"/>
+        </w:rPr>
+      </w:pPr>
+      <w:r>
+        <w:rPr>
+          <w:lang w:val="en-GB"/>
+        </w:rPr>
+        <w:t>So</w:t>
+      </w:r>
+      <w:r>
+        <w:rPr>
+          <w:lang w:val="en-GB"/>
+        </w:rPr>
+        <w:t>,</w:t>
+      </w:r>
+      <w:r>
+        <w:rPr>
+          <w:lang w:val="en-GB"/>
+        </w:rPr>
+        <w:t xml:space="preserve"> I put my lime green coma machine – it’s mine now by the way, just in case anybody here is thinking of remembering that they’re law enforcement officers.</w:t>
+      </w:r>
+    </w:p>
+    <w:p>
+      <w:pPr>
+        <w:rPr>
+          <w:lang w:val="en-GB"/>
+        </w:rPr>
+      </w:pPr>
+      <w:r>
+        <w:rPr>
+          <w:lang w:val="en-GB"/>
+        </w:rPr>
+        <w:t>And then I’m faced with the raw facts of this place. It’s a chapel full of stuff. It’s the holy chapel full of stuff.</w:t>
+      </w:r>
+    </w:p>
+    <w:p>
+      <w:pPr>
+        <w:rPr>
+          <w:lang w:val="en-GB"/>
+        </w:rPr>
+      </w:pPr>
+      <w:r>
+        <w:rPr>
+          <w:lang w:val="en-GB"/>
+        </w:rPr>
+        <w:t xml:space="preserve">Fact – I’m here literally half a day </w:t>
+      </w:r>
+      <w:r>
+        <w:rPr>
+          <w:lang w:val="en-GB"/>
+        </w:rPr>
+        <w:t xml:space="preserve">before some breaks in. </w:t>
+      </w:r>
+    </w:p>
+    <w:p>
+      <w:pPr>
+        <w:rPr>
+          <w:lang w:val="en-GB"/>
+        </w:rPr>
+      </w:pPr>
+      <w:r>
+        <w:rPr>
+          <w:lang w:val="en-GB"/>
+        </w:rPr>
+        <w:t>Fact – they weren’t exactly ruthless professionals, but what they showed was the essential problem with this place.</w:t>
+      </w:r>
+    </w:p>
+    <w:p>
+      <w:pPr>
+        <w:rPr>
+          <w:lang w:val="en-GB"/>
+        </w:rPr>
+      </w:pPr>
+      <w:r>
+        <w:rPr>
+          <w:lang w:val="en-GB"/>
+        </w:rPr>
+        <w:t xml:space="preserve">There’s too much stuff. Is some of </w:t>
+      </w:r>
+      <w:proofErr w:type="gramStart"/>
+      <w:r>
+        <w:rPr>
+          <w:lang w:val="en-GB"/>
+        </w:rPr>
+        <w:t>it</w:t>
+      </w:r>
+      <w:proofErr w:type="gramEnd"/>
+      <w:r>
+        <w:rPr>
+          <w:lang w:val="en-GB"/>
+        </w:rPr>
+        <w:t xml:space="preserve"> gold? Maybe did somebody use the gold to buy rare books and China? Maybe? Could you just grab something and run off with it and hope </w:t>
+      </w:r>
+      <w:r>
+        <w:rPr>
+          <w:lang w:val="en-GB"/>
+        </w:rPr>
         <w:lastRenderedPageBreak/>
-        <w:t>In suspicious circumstances</w:t>
-      </w:r>
-      <w:r>
-        <w:rPr>
-          <w:lang w:val="en-GB"/>
-        </w:rPr>
-        <w:t xml:space="preserve"> – supposition.</w:t>
-      </w:r>
-      <w:r>
-        <w:rPr>
-          <w:lang w:val="en-GB"/>
-        </w:rPr>
-        <w:t xml:space="preserve"> </w:t>
-      </w:r>
-    </w:p>
-    <w:p>
-      <w:pPr>
-        <w:rPr>
-          <w:lang w:val="en-GB"/>
-        </w:rPr>
-      </w:pPr>
-      <w:r>
-        <w:rPr>
-          <w:lang w:val="en-GB"/>
-        </w:rPr>
-        <w:t xml:space="preserve">The police say it’s a suicide – fact. </w:t>
-      </w:r>
-    </w:p>
-    <w:p>
-      <w:pPr>
-        <w:rPr>
-          <w:lang w:val="en-GB"/>
-        </w:rPr>
-      </w:pPr>
-      <w:r>
-        <w:rPr>
-          <w:lang w:val="en-GB"/>
-        </w:rPr>
-        <w:t xml:space="preserve">My car blows up – fact. I’m not in it – fact. </w:t>
-      </w:r>
-    </w:p>
-    <w:p>
-      <w:pPr>
-        <w:rPr>
-          <w:lang w:val="en-GB"/>
-        </w:rPr>
-      </w:pPr>
-      <w:r>
-        <w:rPr>
-          <w:lang w:val="en-GB"/>
-        </w:rPr>
-        <w:t>S</w:t>
-      </w:r>
-      <w:r>
-        <w:rPr>
-          <w:lang w:val="en-GB"/>
-        </w:rPr>
-        <w:t>omeone hoped I would be</w:t>
-      </w:r>
-      <w:r>
-        <w:rPr>
-          <w:lang w:val="en-GB"/>
-        </w:rPr>
-        <w:t xml:space="preserve"> in it</w:t>
-      </w:r>
-      <w:r>
-        <w:rPr>
-          <w:lang w:val="en-GB"/>
-        </w:rPr>
-        <w:t xml:space="preserve"> – </w:t>
-      </w:r>
-      <w:r>
-        <w:rPr>
-          <w:lang w:val="en-GB"/>
-        </w:rPr>
-        <w:t>supposition.</w:t>
-      </w:r>
-    </w:p>
-    <w:p>
-      <w:pPr>
-        <w:rPr>
-          <w:lang w:val="en-GB"/>
-        </w:rPr>
-      </w:pPr>
-      <w:r>
-        <w:rPr>
-          <w:lang w:val="en-GB"/>
-        </w:rPr>
-        <w:t>I’m in a tricky situation – fact. I’m literally in the gutter with an old lady who feeds the pigeons – fact.</w:t>
-      </w:r>
-    </w:p>
-    <w:p>
-      <w:pPr>
-        <w:rPr>
-          <w:lang w:val="en-GB"/>
-        </w:rPr>
-      </w:pPr>
-      <w:r>
-        <w:rPr>
-          <w:lang w:val="en-GB"/>
-        </w:rPr>
-        <w:t>Jan Pausing is my friend – turns out that was just a supposition.</w:t>
-      </w:r>
-    </w:p>
-    <w:p>
-      <w:pPr>
-        <w:rPr>
-          <w:lang w:val="en-GB"/>
-        </w:rPr>
-      </w:pPr>
-      <w:r>
-        <w:rPr>
-          <w:lang w:val="en-GB"/>
-        </w:rPr>
-        <w:t>He suggests I do a job for him as a live-in guardian – fact.</w:t>
-      </w:r>
-    </w:p>
-    <w:p>
-      <w:pPr>
-        <w:rPr>
-          <w:lang w:val="en-GB"/>
-        </w:rPr>
-      </w:pPr>
-      <w:r>
-        <w:rPr>
-          <w:lang w:val="en-GB"/>
-        </w:rPr>
-        <w:t>I believe him when he says it will be an opportunity to lay low – fact.</w:t>
-      </w:r>
-    </w:p>
-    <w:p>
-      <w:pPr>
-        <w:rPr>
-          <w:lang w:val="en-GB"/>
-        </w:rPr>
-      </w:pPr>
-      <w:r>
-        <w:rPr>
-          <w:lang w:val="en-GB"/>
-        </w:rPr>
-        <w:t>I am an utter moron</w:t>
-      </w:r>
-      <w:r>
-        <w:rPr>
-          <w:lang w:val="en-GB"/>
-        </w:rPr>
-        <w:t xml:space="preserve"> who’s easily fooled</w:t>
-      </w:r>
-      <w:r>
-        <w:rPr>
-          <w:lang w:val="en-GB"/>
-        </w:rPr>
-        <w:t xml:space="preserve"> – well, it’s not a supposition.</w:t>
-      </w:r>
-    </w:p>
-    <w:p>
-      <w:pPr>
-        <w:rPr>
-          <w:lang w:val="en-GB"/>
-        </w:rPr>
-      </w:pPr>
-      <w:r>
-        <w:rPr>
-          <w:lang w:val="en-GB"/>
-        </w:rPr>
-        <w:t>My car is a bit – well, easy to spot – fact.</w:t>
-      </w:r>
-    </w:p>
-    <w:p>
-      <w:pPr>
-        <w:rPr>
-          <w:lang w:val="en-GB"/>
-        </w:rPr>
-      </w:pPr>
-      <w:r>
-        <w:rPr>
-          <w:lang w:val="en-GB"/>
-        </w:rPr>
-        <w:t>And I notice the garage is empty – fact.</w:t>
-      </w:r>
-    </w:p>
-    <w:p>
-      <w:pPr>
-        <w:rPr>
-          <w:lang w:val="en-GB"/>
-        </w:rPr>
-      </w:pPr>
-      <w:r>
-        <w:rPr>
-          <w:lang w:val="en-GB"/>
-        </w:rPr>
-        <w:t>So</w:t>
-      </w:r>
-      <w:r>
-        <w:rPr>
-          <w:lang w:val="en-GB"/>
-        </w:rPr>
-        <w:t>,</w:t>
-      </w:r>
-      <w:r>
-        <w:rPr>
-          <w:lang w:val="en-GB"/>
-        </w:rPr>
-        <w:t xml:space="preserve"> I put my lime green coma machine – it’s mine now by the way, just in case anybody here is thinking of remembering that they’re law enforcement officers.</w:t>
-      </w:r>
-    </w:p>
-    <w:p>
-      <w:pPr>
-        <w:rPr>
-          <w:lang w:val="en-GB"/>
-        </w:rPr>
-      </w:pPr>
-      <w:r>
-        <w:rPr>
-          <w:lang w:val="en-GB"/>
-        </w:rPr>
-        <w:t>And then I’m faced with the raw facts of this place. It’s a chapel full of stuff. It’s the holy chapel full of stuff.</w:t>
-      </w:r>
-    </w:p>
-    <w:p>
-      <w:pPr>
-        <w:rPr>
-          <w:lang w:val="en-GB"/>
-        </w:rPr>
-      </w:pPr>
-      <w:r>
-        <w:rPr>
-          <w:lang w:val="en-GB"/>
-        </w:rPr>
-        <w:t xml:space="preserve">Fact – I’m here literally half a day </w:t>
-      </w:r>
-      <w:r>
-        <w:rPr>
-          <w:lang w:val="en-GB"/>
-        </w:rPr>
-        <w:t xml:space="preserve">before some breaks in. </w:t>
-      </w:r>
-    </w:p>
-    <w:p>
-      <w:pPr>
-        <w:rPr>
-          <w:lang w:val="en-GB"/>
-        </w:rPr>
-      </w:pPr>
-      <w:r>
-        <w:rPr>
-          <w:lang w:val="en-GB"/>
-        </w:rPr>
-        <w:t>Fact – they weren’t exactly ruthless professionals, but what they showed was the essential problem with this place.</w:t>
-      </w:r>
-    </w:p>
-    <w:p>
-      <w:pPr>
-        <w:rPr>
-          <w:lang w:val="en-GB"/>
-        </w:rPr>
-      </w:pPr>
-      <w:r>
-        <w:rPr>
-          <w:lang w:val="en-GB"/>
-        </w:rPr>
-        <w:t>There’s too much stuff. Is some of it gold? Maybe did somebody use the gold to buy rare books and China? Maybe? Could you just grab something and run off with it and hope it’s valuable, yes, yes, you could, but that’s not much of a strategy if you suspect that there is 26 million pounds worth of gold here, is it?</w:t>
+        <w:t>it’s valuable, yes, yes, you could, but that’s not much of a strategy if you suspect that there is 26 million pounds worth of gold here, is it?</w:t>
       </w:r>
     </w:p>
     <w:p>

</xml_diff>